<commit_message>
TP Sami : cadrer la refonte et migrer la station 1
</commit_message>
<xml_diff>
--- a/_source/tp-doc-accessible.docx
+++ b/_source/tp-doc-accessible.docx
@@ -2,6 +2,120 @@
 <file path=word/document.xml><?xml version="1.0" encoding="utf-8"?>
 <w:document xmlns:wpc="http://schemas.microsoft.com/office/word/2010/wordprocessingCanvas" xmlns:mo="http://schemas.microsoft.com/office/mac/office/2008/main" xmlns:mc="http://schemas.openxmlformats.org/markup-compatibility/2006" xmlns:mv="urn:schemas-microsoft-com:mac:vml" xmlns:o="urn:schemas-microsoft-com:office:office" xmlns:r="http://schemas.openxmlformats.org/officeDocument/2006/relationships" xmlns:m="http://schemas.openxmlformats.org/officeDocument/2006/math" xmlns:v="urn:schemas-microsoft-com:vml" xmlns:wp14="http://schemas.microsoft.com/office/word/2010/wordprocessingDrawing" xmlns:wp="http://schemas.openxmlformats.org/drawingml/2006/wordprocessingDrawing" xmlns:w10="urn:schemas-microsoft-com:office:word" xmlns:w="http://schemas.openxmlformats.org/wordprocessingml/2006/main" xmlns:w14="http://schemas.microsoft.com/office/word/2010/wordml" xmlns:wpg="http://schemas.microsoft.com/office/word/2010/wordprocessingGroup" xmlns:wpi="http://schemas.microsoft.com/office/word/2010/wordprocessingInk" xmlns:wne="http://schemas.microsoft.com/office/word/2006/wordml" xmlns:wps="http://schemas.microsoft.com/office/word/2010/wordprocessingShape" mc:Ignorable="w14 wp14">
   <w:body>
+    <w:p>
+      <w:pPr>
+        <w:pStyle w:val="Title"/>
+      </w:pPr>
+      <w:r>
+        <w:t>Rendre un document Word accessible</w:t>
+      </w:r>
+    </w:p>
+    <w:p>
+      <w:pPr>
+        <w:pStyle w:val="Heading1"/>
+        <w:numPr>
+          <w:ilvl w:val="0"/>
+          <w:numId w:val="10"/>
+        </w:numPr>
+      </w:pPr>
+      <w:r>
+        <w:t>Structurer et naviguer</w:t>
+      </w:r>
+    </w:p>
+    <w:p>
+      <w:pPr>
+        <w:pStyle w:val="Heading2"/>
+        <w:numPr>
+          <w:ilvl w:val="1"/>
+          <w:numId w:val="10"/>
+        </w:numPr>
+      </w:pPr>
+      <w:r>
+        <w:t>P-01 - Distinguer le titre principal des titres hiérarchiques</w:t>
+      </w:r>
+    </w:p>
+    <w:p>
+      <w:r>
+        <w:t>Problème : Le titre principal et des intertitres sont seulement mis en forme visuellement.</w:t>
+      </w:r>
+    </w:p>
+    <w:p>
+      <w:r>
+        <w:t>Pourquoi : Les technologies d'assistance identifient le document et sa structure.</w:t>
+      </w:r>
+    </w:p>
+    <w:p>
+      <w:r>
+        <w:t>Règle : Utiliser le style Titre pour le titre principal et les styles Titre 1, Titre 2 et suivants pour la hiérarchie.</w:t>
+      </w:r>
+    </w:p>
+    <w:p>
+      <w:r>
+        <w:t>Dans Word : Accueil &gt; Styles, puis appliquer Titre au titre principal et les niveaux de titre aux sections.</w:t>
+      </w:r>
+    </w:p>
+    <w:p>
+      <w:r>
+        <w:t>Dans LibreOffice Writer : Styles &gt; Gérer les styles, puis appliquer Titre et Titre 1 à Titre 3 selon le niveau.</w:t>
+      </w:r>
+    </w:p>
+    <w:p>
+      <w:r>
+        <w:t>À faire : Appliquer les styles adaptés sans changer le texte.</w:t>
+      </w:r>
+    </w:p>
+    <w:p>
+      <w:r>
+        <w:t>Preuve : Styles vérifiables dans le DOCX et structure lisible dans le volet de navigation.</w:t>
+      </w:r>
+    </w:p>
+    <w:p>
+      <w:pPr>
+        <w:pStyle w:val="Heading2"/>
+        <w:numPr>
+          <w:ilvl w:val="1"/>
+          <w:numId w:val="10"/>
+        </w:numPr>
+      </w:pPr>
+      <w:r>
+        <w:t>P-02 - Construire une hiérarchie de titres cohérente</w:t>
+      </w:r>
+    </w:p>
+    <w:p>
+      <w:r>
+        <w:t>Problème : La hiérarchie saute un niveau et la numérotation visuelle contredit la structure.</w:t>
+      </w:r>
+    </w:p>
+    <w:p>
+      <w:r>
+        <w:t>Pourquoi : Une structure sans saut rend le plan compréhensible et navigable.</w:t>
+      </w:r>
+    </w:p>
+    <w:p>
+      <w:r>
+        <w:t>Règle : Enchaîner les niveaux de titres sans saut et conserver une numérotation cohérente.</w:t>
+      </w:r>
+    </w:p>
+    <w:p>
+      <w:r>
+        <w:t>Dans Word : Affichage &gt; Volet de navigation, puis corriger les styles depuis Accueil &gt; Styles.</w:t>
+      </w:r>
+    </w:p>
+    <w:p>
+      <w:r>
+        <w:t>Dans LibreOffice Writer : Affichage &gt; Navigateur, puis corriger les styles depuis Styles &gt; Gérer les styles.</w:t>
+      </w:r>
+    </w:p>
+    <w:p>
+      <w:r>
+        <w:t>À faire : Réordonner les niveaux de styles et leur numérotation.</w:t>
+      </w:r>
+    </w:p>
+    <w:p>
+      <w:r>
+        <w:t>Preuve : Ordre des niveaux contrôlé dans le XML et confirmé dans le volet de navigation.</w:t>
+      </w:r>
+    </w:p>
     <w:p>
       <w:r>
         <w:rPr>
@@ -51,6 +165,53 @@
       </w:r>
       <w:r>
         <w:fldChar w:fldCharType="end"/>
+      </w:r>
+    </w:p>
+    <w:p>
+      <w:pPr>
+        <w:pStyle w:val="Heading2"/>
+        <w:numPr>
+          <w:ilvl w:val="1"/>
+          <w:numId w:val="10"/>
+        </w:numPr>
+      </w:pPr>
+      <w:r>
+        <w:t>P-03 - Naviguer et générer un sommaire automatique</w:t>
+      </w:r>
+    </w:p>
+    <w:p>
+      <w:r>
+        <w:t>Problème : Le document ne propose pas de sommaire automatique actualisable.</w:t>
+      </w:r>
+    </w:p>
+    <w:p>
+      <w:r>
+        <w:t>Pourquoi : Le volet et le sommaire donnent deux accès fiables à la structure.</w:t>
+      </w:r>
+    </w:p>
+    <w:p>
+      <w:r>
+        <w:t>Règle : Vérifier le plan dans le volet de navigation et insérer un sommaire fondé sur les styles de titres.</w:t>
+      </w:r>
+    </w:p>
+    <w:p>
+      <w:r>
+        <w:t>Dans Word : Références &gt; Table des matières &gt; Table automatique, puis clic droit &gt; Mettre à jour les champs.</w:t>
+      </w:r>
+    </w:p>
+    <w:p>
+      <w:r>
+        <w:t>Dans LibreOffice Writer : Insertion &gt; Table des matières et index &gt; Table des matières, index ou bibliographie.</w:t>
+      </w:r>
+    </w:p>
+    <w:p>
+      <w:r>
+        <w:t>À faire : Contrôler le volet, insérer le sommaire et vérifier sa mise à jour.</w:t>
+      </w:r>
+    </w:p>
+    <w:p>
+      <w:r>
+        <w:t>Preuve : Navigation cohérente et sommaire actualisable après modification d'un titre.</w:t>
       </w:r>
     </w:p>
     <w:p>
@@ -331,6 +492,53 @@
       </w:tr>
     </w:tbl>
     <w:p>
+      <w:pPr>
+        <w:pStyle w:val="Heading2"/>
+        <w:numPr>
+          <w:ilvl w:val="1"/>
+          <w:numId w:val="10"/>
+        </w:numPr>
+      </w:pPr>
+      <w:r>
+        <w:t>P-04 - Utiliser des listes natives</w:t>
+      </w:r>
+    </w:p>
+    <w:p>
+      <w:r>
+        <w:t>Problème : Une liste est simulée avec des caractères saisis au début des paragraphes.</w:t>
+      </w:r>
+    </w:p>
+    <w:p>
+      <w:r>
+        <w:t>Pourquoi : Les lecteurs d'écran annoncent la nature et la longueur des listes.</w:t>
+      </w:r>
+    </w:p>
+    <w:p>
+      <w:r>
+        <w:t>Règle : Créer les puces et numéros avec les fonctions de liste du traitement de texte.</w:t>
+      </w:r>
+    </w:p>
+    <w:p>
+      <w:r>
+        <w:t>Dans Word : Sélectionner les paragraphes, puis Accueil &gt; Puces ou Numérotation.</w:t>
+      </w:r>
+    </w:p>
+    <w:p>
+      <w:r>
+        <w:t>Dans LibreOffice Writer : Sélectionner les paragraphes, puis Format &gt; Puces et numérotation.</w:t>
+      </w:r>
+    </w:p>
+    <w:p>
+      <w:r>
+        <w:t>À faire : Remplacer la fausse liste par une liste native.</w:t>
+      </w:r>
+    </w:p>
+    <w:p>
+      <w:r>
+        <w:t>Preuve : Structure de liste présente dans le DOCX et annoncée comme liste.</w:t>
+      </w:r>
+    </w:p>
+    <w:p>
       <w:r>
         <w:t>Objectifs du trimestre :</w:t>
       </w:r>
@@ -386,6 +594,133 @@
       </w:pPr>
       <w:r>
         <w:t>Déploiement de la newsletter</w:t>
+      </w:r>
+    </w:p>
+    <w:p>
+      <w:pPr>
+        <w:pStyle w:val="Heading2"/>
+        <w:numPr>
+          <w:ilvl w:val="1"/>
+          <w:numId w:val="10"/>
+        </w:numPr>
+      </w:pPr>
+      <w:r>
+        <w:t>P-05 - Employer les fonctions de mise en page adaptées</w:t>
+      </w:r>
+    </w:p>
+    <w:p>
+      <w:r>
+        <w:t>Problème : Une zone cumule paragraphes vides, espaces successifs, tabulations, retours forcés et saut inadapté.</w:t>
+      </w:r>
+    </w:p>
+    <w:p>
+      <w:r>
+        <w:t>Pourquoi : Une mise en page robuste reste compréhensible quand l'affichage ou la restitution change.</w:t>
+      </w:r>
+    </w:p>
+    <w:p>
+      <w:r>
+        <w:t>Règle : Utiliser espacements, retraits, sauts et colonnes plutôt que paragraphes vides, espaces, tabulations ou retours forcés.</w:t>
+      </w:r>
+    </w:p>
+    <w:p>
+      <w:r>
+        <w:t>Dans Word : Accueil &gt; Afficher tout, puis régler Paragraphe, Mise en page &gt; Sauts et Mise en page &gt; Colonnes.</w:t>
+      </w:r>
+    </w:p>
+    <w:p>
+      <w:r>
+        <w:t>Dans LibreOffice Writer : Affichage &gt; Marques de formatage, puis Format &gt; Paragraphe et Format &gt; Style de page.</w:t>
+      </w:r>
+    </w:p>
+    <w:p>
+      <w:r>
+        <w:t>À faire : Afficher les marques puis remplacer chaque artifice par la fonction prévue.</w:t>
+      </w:r>
+    </w:p>
+    <w:p>
+      <w:r>
+        <w:t>Preuve : Absence des artifices ciblés dans le XML et contrôle visuel avec marques affichées.</w:t>
+      </w:r>
+    </w:p>
+    <w:p>
+      <w:pPr>
+        <w:pStyle w:val="Heading3"/>
+      </w:pPr>
+      <w:r>
+        <w:t>Mise en page robuste</w:t>
+      </w:r>
+    </w:p>
+    <w:p>
+      <w:pPr>
+        <w:spacing w:after="240"/>
+      </w:pPr>
+      <w:r>
+        <w:t>Espacement entre les paragraphes</w:t>
+      </w:r>
+    </w:p>
+    <w:p>
+      <w:pPr>
+        <w:ind w:left="720"/>
+      </w:pPr>
+      <w:r>
+        <w:t>Retrait du paragraphe aligné avec le contenu précédent.</w:t>
+      </w:r>
+    </w:p>
+    <w:p>
+      <w:r>
+        <w:t>Ligne principale</w:t>
+      </w:r>
+    </w:p>
+    <w:p>
+      <w:r>
+        <w:t>Suite sur un paragraphe distinct</w:t>
+      </w:r>
+    </w:p>
+    <w:p>
+      <w:pPr>
+        <w:pageBreakBefore/>
+      </w:pPr>
+      <w:r>
+        <w:t>Début de la page suivante</w:t>
+      </w:r>
+    </w:p>
+    <w:p>
+      <w:pPr>
+        <w:sectPr>
+          <w:headerReference w:type="default" r:id="rId9"/>
+          <w:footerReference w:type="default" r:id="rId10"/>
+          <w:pgSz w:w="12240" w:h="15840"/>
+          <w:pgMar w:top="1440" w:right="1800" w:bottom="1440" w:left="1800" w:header="720" w:footer="720" w:gutter="0"/>
+          <w:cols w:space="720"/>
+          <w:docGrid w:linePitch="360"/>
+        </w:sectPr>
+      </w:pPr>
+    </w:p>
+    <w:p>
+      <w:r>
+        <w:t>Colonne gauche : structure</w:t>
+      </w:r>
+    </w:p>
+    <w:p>
+      <w:r>
+        <w:t>Colonne droite : navigation</w:t>
+      </w:r>
+    </w:p>
+    <w:p>
+      <w:pPr>
+        <w:sectPr>
+          <w:type w:val="continuous"/>
+          <w:pgSz w:w="12240" w:h="15840"/>
+          <w:pgMar w:top="1440" w:right="1800" w:bottom="1440" w:left="1800" w:header="720" w:footer="720" w:gutter="0"/>
+          <w:cols w:space="720" w:num="2"/>
+          <w:docGrid w:linePitch="360"/>
+        </w:sectPr>
+      </w:pPr>
+    </w:p>
+    <w:p>
+      <w:r>
+        <w:t>Fin de la zone Mise en page robuste.</w:t>
       </w:r>
     </w:p>
     <w:p>
@@ -758,11 +1093,10 @@
       </w:r>
     </w:p>
     <w:sectPr>
-      <w:headerReference w:type="default" r:id="rId9"/>
-      <w:footerReference w:type="default" r:id="rId10"/>
+      <w:type w:val="continuous"/>
       <w:pgSz w:w="12240" w:h="15840"/>
       <w:pgMar w:top="1440" w:right="1800" w:bottom="1440" w:left="1800" w:header="720" w:footer="720" w:gutter="0"/>
-      <w:cols w:space="720"/>
+      <w:cols w:space="720" w:num="1"/>
       <w:docGrid w:linePitch="360"/>
     </w:sectPr>
   </w:body>
@@ -1110,6 +1444,36 @@
   </w:num>
   <w:num w:numId="9">
     <w:abstractNumId w:val="0"/>
+  </w:num>
+  <w:abstractNum w:abstractNumId="9">
+    <w:multiLevelType w:val="multilevel"/>
+    <w:lvl w:ilvl="0">
+      <w:start w:val="1"/>
+      <w:numFmt w:val="decimal"/>
+      <w:lvlText w:val="%1."/>
+      <w:suff w:val="space"/>
+    </w:lvl>
+    <w:lvl w:ilvl="1">
+      <w:start w:val="1"/>
+      <w:numFmt w:val="decimal"/>
+      <w:lvlText w:val="%1.%2."/>
+      <w:suff w:val="space"/>
+    </w:lvl>
+    <w:lvl w:ilvl="2">
+      <w:start w:val="1"/>
+      <w:numFmt w:val="decimal"/>
+      <w:lvlText w:val="%1.%2.%3."/>
+      <w:suff w:val="space"/>
+    </w:lvl>
+    <w:lvl w:ilvl="3">
+      <w:start w:val="1"/>
+      <w:numFmt w:val="decimal"/>
+      <w:lvlText w:val="%1.%2.%3.%4."/>
+      <w:suff w:val="space"/>
+    </w:lvl>
+  </w:abstractNum>
+  <w:num w:numId="10">
+    <w:abstractNumId w:val="9"/>
   </w:num>
 </w:numbering>
 </file>

</xml_diff>

<commit_message>
TP Sami : migration de la station 2
</commit_message>
<xml_diff>
--- a/_source/tp-doc-accessible.docx
+++ b/_source/tp-doc-accessible.docx
@@ -114,15 +114,6 @@
     <w:p>
       <w:r>
         <w:t>Preuve : Ordre des niveaux contrôlé dans le XML et confirmé dans le volet de navigation.</w:t>
-      </w:r>
-    </w:p>
-    <w:p>
-      <w:r>
-        <w:rPr>
-          <w:rFonts w:ascii="Arial" w:hAnsi="Arial"/>
-          <w:sz w:val="22"/>
-        </w:rPr>
-        <w:t>Document confidentiel</w:t>
       </w:r>
     </w:p>
     <w:p>
@@ -725,10 +716,61 @@
     </w:p>
     <w:p>
       <w:pPr>
-        <w:pStyle w:val="Heading3"/>
+        <w:pStyle w:val="Heading1"/>
+        <w:numPr>
+          <w:ilvl w:val="0"/>
+          <w:numId w:val="10"/>
+        </w:numPr>
       </w:pPr>
       <w:r>
-        <w:t>Détail par canal</w:t>
+        <w:t>Rendre les contenus et les liens compréhensibles</w:t>
+      </w:r>
+    </w:p>
+    <w:p>
+      <w:pPr>
+        <w:pStyle w:val="Heading2"/>
+        <w:numPr>
+          <w:ilvl w:val="1"/>
+          <w:numId w:val="10"/>
+        </w:numPr>
+      </w:pPr>
+      <w:r>
+        <w:t>P-06 - Rédiger l'alternative d'une image informative simple</w:t>
+      </w:r>
+    </w:p>
+    <w:p>
+      <w:r>
+        <w:t>Problème : Une image informative possède une alternative absente ou inadéquate.</w:t>
+      </w:r>
+    </w:p>
+    <w:p>
+      <w:r>
+        <w:t>Pourquoi : Une personne qui ne voit pas l'image reçoit son information utile.</w:t>
+      </w:r>
+    </w:p>
+    <w:p>
+      <w:r>
+        <w:t>Règle : Rédiger une alternative concise liée au contexte, sans reprendre automatiquement une description générée.</w:t>
+      </w:r>
+    </w:p>
+    <w:p>
+      <w:r>
+        <w:t>Dans Word : Clic droit sur l'image &gt; Afficher le texte de remplacement, puis renseigner la description.</w:t>
+      </w:r>
+    </w:p>
+    <w:p>
+      <w:r>
+        <w:t>Dans LibreOffice Writer : Clic droit sur l'image &gt; Propriétés &gt; Options, puis renseigner le texte alternatif.</w:t>
+      </w:r>
+    </w:p>
+    <w:p>
+      <w:r>
+        <w:t>À faire : Observer le rôle de l'image et rédiger soi-même son alternative.</w:t>
+      </w:r>
+    </w:p>
+    <w:p>
+      <w:r>
+        <w:t>Preuve : Alternative présente dans le DOCX et jugée pertinente par lecture humaine.</w:t>
       </w:r>
     </w:p>
     <w:p>
@@ -738,8 +780,8 @@
       <w:r>
         <w:drawing>
           <wp:inline xmlns:a="http://schemas.openxmlformats.org/drawingml/2006/main" xmlns:pic="http://schemas.openxmlformats.org/drawingml/2006/picture">
-            <wp:extent cx="4114800" cy="2468880"/>
-            <wp:docPr id="1" name="Picture 1" descr="Graphique d'évolution du trafic web T1 2025 : visiteurs uniques en hausse de 12 %, pages vues +11 %, taux de rebond en baisse de 4 points." title="Trafic web T1 2025"/>
+            <wp:extent cx="457200" cy="457200"/>
+            <wp:docPr id="1" name="Picture 1" descr="Contact par courriel." title="Contact par courriel"/>
             <wp:cNvGraphicFramePr>
               <a:graphicFrameLocks noChangeAspect="1"/>
             </wp:cNvGraphicFramePr>
@@ -747,7 +789,7 @@
               <a:graphicData uri="http://schemas.openxmlformats.org/drawingml/2006/picture">
                 <pic:pic>
                   <pic:nvPicPr>
-                    <pic:cNvPr id="0" name="graphique-accessible.png"/>
+                    <pic:cNvPr id="0" name="icone-enveloppe.png"/>
                     <pic:cNvPicPr/>
                   </pic:nvPicPr>
                   <pic:blipFill>
@@ -759,7 +801,7 @@
                   <pic:spPr>
                     <a:xfrm>
                       <a:off x="0" y="0"/>
-                      <a:ext cx="4114800" cy="2468880"/>
+                      <a:ext cx="457200" cy="457200"/>
                     </a:xfrm>
                     <a:prstGeom prst="rect"/>
                   </pic:spPr>
@@ -773,9 +815,48 @@
     <w:p>
       <w:pPr>
         <w:pStyle w:val="Heading2"/>
+        <w:numPr>
+          <w:ilvl w:val="1"/>
+          <w:numId w:val="10"/>
+        </w:numPr>
       </w:pPr>
       <w:r>
-        <w:t>Organisation du service</w:t>
+        <w:t>P-07 - Décrire une image complexe</w:t>
+      </w:r>
+    </w:p>
+    <w:p>
+      <w:r>
+        <w:t>Problème : Une image complexe n'offre ni résumé utile ni description détaillée équivalente.</w:t>
+      </w:r>
+    </w:p>
+    <w:p>
+      <w:r>
+        <w:t>Pourquoi : Les données ou relations complexes restent disponibles sous forme textuelle.</w:t>
+      </w:r>
+    </w:p>
+    <w:p>
+      <w:r>
+        <w:t>Règle : Associer une alternative courte à une description détaillée adjacente dans le corps.</w:t>
+      </w:r>
+    </w:p>
+    <w:p>
+      <w:r>
+        <w:t>Dans Word : Ajouter le texte de remplacement, puis saisir la description détaillée dans un paragraphe voisin.</w:t>
+      </w:r>
+    </w:p>
+    <w:p>
+      <w:r>
+        <w:t>Dans LibreOffice Writer : Renseigner le texte alternatif dans les propriétés, puis ajouter la description dans le corps.</w:t>
+      </w:r>
+    </w:p>
+    <w:p>
+      <w:r>
+        <w:t>À faire : Ajouter une alternative courte et une description structurée à proximité.</w:t>
+      </w:r>
+    </w:p>
+    <w:p>
+      <w:r>
+        <w:t>Preuve : Équivalence d'information vérifiée sans consulter l'image.</w:t>
       </w:r>
     </w:p>
     <w:p>
@@ -829,9 +910,48 @@
     <w:p>
       <w:pPr>
         <w:pStyle w:val="Heading2"/>
+        <w:numPr>
+          <w:ilvl w:val="1"/>
+          <w:numId w:val="10"/>
+        </w:numPr>
       </w:pPr>
       <w:r>
-        <w:t>Contact</w:t>
+        <w:t>P-08 - Marquer une image redondante comme décorative</w:t>
+      </w:r>
+    </w:p>
+    <w:p>
+      <w:r>
+        <w:t>Problème : Une image purement redondante est annoncée comme si elle apportait une information.</w:t>
+      </w:r>
+    </w:p>
+    <w:p>
+      <w:r>
+        <w:t>Pourquoi : Les images sans information n'alourdissent pas la restitution.</w:t>
+      </w:r>
+    </w:p>
+    <w:p>
+      <w:r>
+        <w:t>Règle : Déclarer décorative uniquement une image dont l'information est déjà entièrement donnée par le texte voisin.</w:t>
+      </w:r>
+    </w:p>
+    <w:p>
+      <w:r>
+        <w:t>Dans Word : Afficher le texte de remplacement puis cocher Marquer comme décoratif.</w:t>
+      </w:r>
+    </w:p>
+    <w:p>
+      <w:r>
+        <w:t>Dans LibreOffice Writer : Si l'option Décoratif existe, l'activer ; sinon laisser titre et description vides seulement après vérification de la redondance.</w:t>
+      </w:r>
+    </w:p>
+    <w:p>
+      <w:r>
+        <w:t>À faire : Vérifier la redondance puis appliquer le traitement décoratif adapté au logiciel.</w:t>
+      </w:r>
+    </w:p>
+    <w:p>
+      <w:r>
+        <w:t>Preuve : Marqueur décoratif ou équivalent vérifié et absence de perte d'information confirmée.</w:t>
       </w:r>
     </w:p>
     <w:p>
@@ -860,7 +980,7 @@
                     <pic:cNvPicPr/>
                   </pic:nvPicPr>
                   <pic:blipFill>
-                    <a:blip r:embed="rId13"/>
+                    <a:blip r:embed="rId11"/>
                     <a:stretch>
                       <a:fillRect/>
                     </a:stretch>
@@ -883,13 +1003,50 @@
       </w:r>
     </w:p>
     <w:p>
+      <w:pPr>
+        <w:pStyle w:val="Heading2"/>
+        <w:numPr>
+          <w:ilvl w:val="1"/>
+          <w:numId w:val="10"/>
+        </w:numPr>
+      </w:pPr>
       <w:r>
-        <w:rPr>
-          <w:rFonts w:ascii="Arial" w:hAnsi="Arial"/>
-          <w:sz w:val="22"/>
-          <w:lang w:val="en-US"/>
-        </w:rPr>
-        <w:t>The quarterly report is available upon request. Please contact the communication department for further details.</w:t>
+        <w:t>P-09 - Remplacer une image de texte par du vrai texte</w:t>
+      </w:r>
+    </w:p>
+    <w:p>
+      <w:r>
+        <w:t>Problème : Une consigne utile est uniquement présente dans une image de texte.</w:t>
+      </w:r>
+    </w:p>
+    <w:p>
+      <w:r>
+        <w:t>Pourquoi : Le contenu peut être sélectionné, agrandi, recherché et restitué correctement.</w:t>
+      </w:r>
+    </w:p>
+    <w:p>
+      <w:r>
+        <w:t>Règle : Saisir en texte réel toute information textuelle qui n'a pas besoin d'être une image.</w:t>
+      </w:r>
+    </w:p>
+    <w:p>
+      <w:r>
+        <w:t>Dans Word : Insérer le texte dans un paragraphe structuré, appliquer les styles utiles puis supprimer l'image de texte.</w:t>
+      </w:r>
+    </w:p>
+    <w:p>
+      <w:r>
+        <w:t>Dans LibreOffice Writer : Saisir le texte dans le corps, appliquer les styles utiles puis supprimer l'image de texte.</w:t>
+      </w:r>
+    </w:p>
+    <w:p>
+      <w:r>
+        <w:t>À faire : Reproduire fidèlement le texte dans le corps puis retirer l'image devenue inutile.</w:t>
+      </w:r>
+    </w:p>
+    <w:p>
+      <w:r>
+        <w:t>Preuve : Texte sélectionnable présent dans le DOCX et image de texte absente.</w:t>
       </w:r>
     </w:p>
     <w:p>
@@ -899,6 +1056,183 @@
           <w:sz w:val="22"/>
         </w:rPr>
         <w:t>Avis important : les indicateurs du T2 2025 seront transmis avant le 15 septembre 2025.</w:t>
+      </w:r>
+    </w:p>
+    <w:p>
+      <w:pPr>
+        <w:pStyle w:val="Heading2"/>
+        <w:numPr>
+          <w:ilvl w:val="1"/>
+          <w:numId w:val="10"/>
+        </w:numPr>
+      </w:pPr>
+      <w:r>
+        <w:t>P-10 - Rendre les liens autonomes et identifiables</w:t>
+      </w:r>
+    </w:p>
+    <w:p>
+      <w:r>
+        <w:t>Problème : Un lien générique ne décrit pas sa destination et un téléchargement manque d'informations utiles.</w:t>
+      </w:r>
+    </w:p>
+    <w:p>
+      <w:r>
+        <w:t>Pourquoi : La destination reste compréhensible hors contexte et repérable visuellement.</w:t>
+      </w:r>
+    </w:p>
+    <w:p>
+      <w:r>
+        <w:t>Règle : Employer un libellé explicite et ajouter format, poids et langue d'un téléchargement lorsque ces informations sont connues.</w:t>
+      </w:r>
+    </w:p>
+    <w:p>
+      <w:r>
+        <w:t>Dans Word : Modifier le texte affiché du lien via clic droit &gt; Modifier le lien, puis compléter le libellé dans le corps.</w:t>
+      </w:r>
+    </w:p>
+    <w:p>
+      <w:r>
+        <w:t>Dans LibreOffice Writer : Clic droit &gt; Modifier l'hyperlien, puis compléter le libellé dans le corps.</w:t>
+      </w:r>
+    </w:p>
+    <w:p>
+      <w:r>
+        <w:t>À faire : Réécrire le libellé sans changer la destination puis compléter les informations disponibles.</w:t>
+      </w:r>
+    </w:p>
+    <w:p>
+      <w:r>
+        <w:t>Preuve : Destination inchangée, libellé explicite et identification visuelle vérifiées.</w:t>
+      </w:r>
+    </w:p>
+    <w:p>
+      <w:r>
+        <w:t xml:space="preserve">Pour accéder aux annexes, </w:t>
+      </w:r>
+      <w:hyperlink r:id="rId13">
+        <w:r>
+          <w:rPr>
+            <w:color w:val="0000FF"/>
+            <w:u w:val="single"/>
+          </w:rPr>
+          <w:t>Consulter les annexes du rapport T1 2025 (PDF, 1,2 Mo, français)</w:t>
+        </w:r>
+      </w:hyperlink>
+      <w:r>
+        <w:t>.</w:t>
+      </w:r>
+    </w:p>
+    <w:p>
+      <w:pPr>
+        <w:pStyle w:val="Heading2"/>
+        <w:numPr>
+          <w:ilvl w:val="1"/>
+          <w:numId w:val="10"/>
+        </w:numPr>
+      </w:pPr>
+      <w:r>
+        <w:t>P-11 - Reprendre dans le corps l'information d'un filigrane</w:t>
+      </w:r>
+    </w:p>
+    <w:p>
+      <w:r>
+        <w:t>Problème : Le statut du document apparaît seulement dans un filigrane.</w:t>
+      </w:r>
+    </w:p>
+    <w:p>
+      <w:r>
+        <w:t>Pourquoi : Une information essentielle reste disponible même si le filigrane n'est pas restitué.</w:t>
+      </w:r>
+    </w:p>
+    <w:p>
+      <w:r>
+        <w:t>Règle : Ne jamais faire porter une information essentielle uniquement par un filigrane, un en-tête ou un arrière-plan.</w:t>
+      </w:r>
+    </w:p>
+    <w:p>
+      <w:r>
+        <w:t>Dans Word : Ajouter le statut dans le corps avec un style adapté ; conserver ou retirer le filigrane selon son utilité visuelle.</w:t>
+      </w:r>
+    </w:p>
+    <w:p>
+      <w:r>
+        <w:t>Dans LibreOffice Writer : Ajouter le statut dans le corps avec un style adapté ; traiter l'arrière-plan séparément.</w:t>
+      </w:r>
+    </w:p>
+    <w:p>
+      <w:r>
+        <w:t>À faire : Reprendre le même statut à un emplacement logique du corps.</w:t>
+      </w:r>
+    </w:p>
+    <w:p>
+      <w:r>
+        <w:t>Preuve : Statut compréhensible dans le texte linéarisé sans en-tête ni arrière-plan.</w:t>
+      </w:r>
+    </w:p>
+    <w:p>
+      <w:r>
+        <w:rPr>
+          <w:rFonts w:ascii="Arial" w:hAnsi="Arial"/>
+          <w:sz w:val="22"/>
+        </w:rPr>
+        <w:t>Document confidentiel</w:t>
+      </w:r>
+    </w:p>
+    <w:p>
+      <w:pPr>
+        <w:pStyle w:val="Heading3"/>
+      </w:pPr>
+      <w:r>
+        <w:t>Détail par canal</w:t>
+      </w:r>
+    </w:p>
+    <w:p>
+      <w:pPr>
+        <w:jc w:val="center"/>
+      </w:pPr>
+      <w:r>
+        <w:drawing>
+          <wp:inline xmlns:a="http://schemas.openxmlformats.org/drawingml/2006/main" xmlns:pic="http://schemas.openxmlformats.org/drawingml/2006/picture">
+            <wp:extent cx="4114800" cy="2468880"/>
+            <wp:docPr id="4" name="Picture 4" descr="Graphique d'évolution du trafic web T1 2025 : visiteurs uniques en hausse de 12 %, pages vues +11 %, taux de rebond en baisse de 4 points." title="Trafic web T1 2025"/>
+            <wp:cNvGraphicFramePr>
+              <a:graphicFrameLocks noChangeAspect="1"/>
+            </wp:cNvGraphicFramePr>
+            <a:graphic>
+              <a:graphicData uri="http://schemas.openxmlformats.org/drawingml/2006/picture">
+                <pic:pic>
+                  <pic:nvPicPr>
+                    <pic:cNvPr id="0" name="graphique-accessible.png"/>
+                    <pic:cNvPicPr/>
+                  </pic:nvPicPr>
+                  <pic:blipFill>
+                    <a:blip r:embed="rId14"/>
+                    <a:stretch>
+                      <a:fillRect/>
+                    </a:stretch>
+                  </pic:blipFill>
+                  <pic:spPr>
+                    <a:xfrm>
+                      <a:off x="0" y="0"/>
+                      <a:ext cx="4114800" cy="2468880"/>
+                    </a:xfrm>
+                    <a:prstGeom prst="rect"/>
+                  </pic:spPr>
+                </pic:pic>
+              </a:graphicData>
+            </a:graphic>
+          </wp:inline>
+        </w:drawing>
+      </w:r>
+    </w:p>
+    <w:p>
+      <w:r>
+        <w:rPr>
+          <w:rFonts w:ascii="Arial" w:hAnsi="Arial"/>
+          <w:sz w:val="22"/>
+          <w:lang w:val="en-US"/>
+        </w:rPr>
+        <w:t>The quarterly report is available upon request. Please contact the communication department for further details.</w:t>
       </w:r>
     </w:p>
     <w:p>
@@ -1070,17 +1404,6 @@
         </w:rPr>
         <w:t>Annexes</w:t>
       </w:r>
-    </w:p>
-    <w:p>
-      <w:hyperlink r:id="rId14">
-        <w:r>
-          <w:rPr>
-            <w:color w:val="0000FF"/>
-            <w:u w:val="single"/>
-          </w:rPr>
-          <w:t>Consulter les annexes du rapport T1 2025 (PDF, 1,2 Mo)</w:t>
-        </w:r>
-      </w:hyperlink>
     </w:p>
     <w:p>
       <w:r>

</xml_diff>

<commit_message>
TP Sami : migration de la station 3
</commit_message>
<xml_diff>
--- a/_source/tp-doc-accessible.docx
+++ b/_source/tp-doc-accessible.docx
@@ -244,7 +244,8 @@
       </w:tblGrid>
       <w:tr>
         <w:trPr>
-          <w:tblHeader val="true"/>
+          <w:tblHeader w:val="true"/>
+          <w:cantSplit w:val="true"/>
         </w:trPr>
         <w:tc>
           <w:tcPr>
@@ -308,6 +309,9 @@
         </w:tc>
       </w:tr>
       <w:tr>
+        <w:trPr>
+          <w:cantSplit w:val="true"/>
+        </w:trPr>
         <w:tc>
           <w:tcPr>
             <w:tcW w:type="dxa" w:w="2160"/>
@@ -366,6 +370,9 @@
         </w:tc>
       </w:tr>
       <w:tr>
+        <w:trPr>
+          <w:cantSplit w:val="true"/>
+        </w:trPr>
         <w:tc>
           <w:tcPr>
             <w:tcW w:type="dxa" w:w="2160"/>
@@ -424,6 +431,9 @@
         </w:tc>
       </w:tr>
       <w:tr>
+        <w:trPr>
+          <w:cantSplit w:val="true"/>
+        </w:trPr>
         <w:tc>
           <w:tcPr>
             <w:tcW w:type="dxa" w:w="2160"/>
@@ -1180,6 +1190,122 @@
     </w:p>
     <w:p>
       <w:pPr>
+        <w:pStyle w:val="Heading1"/>
+        <w:numPr>
+          <w:ilvl w:val="0"/>
+          <w:numId w:val="10"/>
+        </w:numPr>
+      </w:pPr>
+      <w:r>
+        <w:t>Sécuriser couleurs, graphiques et tableaux</w:t>
+      </w:r>
+    </w:p>
+    <w:p>
+      <w:pPr>
+        <w:pStyle w:val="Heading2"/>
+        <w:numPr>
+          <w:ilvl w:val="1"/>
+          <w:numId w:val="10"/>
+        </w:numPr>
+      </w:pPr>
+      <w:r>
+        <w:t>P-12 - Mesurer les contrastes utiles</w:t>
+      </w:r>
+    </w:p>
+    <w:p>
+      <w:r>
+        <w:t>Problème : Une couleur volontairement insuffisante est utilisée sans mesure.</w:t>
+      </w:r>
+    </w:p>
+    <w:p>
+      <w:r>
+        <w:t>Pourquoi : Les textes et éléments graphiques restent perceptibles avec une vision réduite ou altérée.</w:t>
+      </w:r>
+    </w:p>
+    <w:p>
+      <w:r>
+        <w:t>Règle : Mesurer au moins 4,5 pour 1 pour le texte normal et 3 pour 1 pour le grand texte ou les éléments graphiques pertinents.</w:t>
+      </w:r>
+    </w:p>
+    <w:p>
+      <w:r>
+        <w:t>Dans Word : Relever les couleurs de police et de fond, mesurer avec l'outil de contraste, puis modifier la couleur de police.</w:t>
+      </w:r>
+    </w:p>
+    <w:p>
+      <w:r>
+        <w:t>Dans LibreOffice Writer : Relever les couleurs de caractère et d'arrière-plan, mesurer, puis modifier la couleur de caractère.</w:t>
+      </w:r>
+    </w:p>
+    <w:p>
+      <w:r>
+        <w:t>À faire : Mesurer la combinaison puis choisir une couleur qui atteint le seuil applicable.</w:t>
+      </w:r>
+    </w:p>
+    <w:p>
+      <w:r>
+        <w:t>Preuve : Ratio calculé conservé et couleurs finales vérifiées dans le document.</w:t>
+      </w:r>
+    </w:p>
+    <w:p>
+      <w:r>
+        <w:rPr>
+          <w:rFonts w:ascii="Arial" w:hAnsi="Arial"/>
+          <w:color w:val="595959"/>
+          <w:sz w:val="22"/>
+        </w:rPr>
+        <w:t>Information complémentaire : résultats provisoires.</w:t>
+      </w:r>
+    </w:p>
+    <w:p>
+      <w:pPr>
+        <w:pStyle w:val="Heading2"/>
+        <w:numPr>
+          <w:ilvl w:val="1"/>
+          <w:numId w:val="10"/>
+        </w:numPr>
+      </w:pPr>
+      <w:r>
+        <w:t>P-13 - Ne pas transmettre une information par la couleur seule</w:t>
+      </w:r>
+    </w:p>
+    <w:p>
+      <w:r>
+        <w:t>Problème : Un graphique distingue ses séries uniquement par la couleur.</w:t>
+      </w:r>
+    </w:p>
+    <w:p>
+      <w:r>
+        <w:t>Pourquoi : L'information reste disponible sans perception fiable des couleurs.</w:t>
+      </w:r>
+    </w:p>
+    <w:p>
+      <w:r>
+        <w:t>Règle : Ajouter étiquettes, motifs ou un équivalent textuel complet à tout code couleur porteur d'information.</w:t>
+      </w:r>
+    </w:p>
+    <w:p>
+      <w:r>
+        <w:t>Dans Word : Insertion &gt; Graphique &gt; Histogramme groupé, reporter les valeurs affichées dans l'image, puis afficher les étiquettes et appliquer des motifs distincts.</w:t>
+      </w:r>
+    </w:p>
+    <w:p>
+      <w:r>
+        <w:t>Dans LibreOffice Writer : Insertion &gt; Diagramme, reporter les valeurs affichées dans l'image, puis afficher les étiquettes et choisir des remplissages distincts.</w:t>
+      </w:r>
+    </w:p>
+    <w:p>
+      <w:r>
+        <w:t>À faire : Reconstruire dans Word le graphique à partir des valeurs affichées dans l'image, puis ajouter des étiquettes et des motifs ou conserver un équivalent textuel complet.</w:t>
+      </w:r>
+    </w:p>
+    <w:p>
+      <w:r>
+        <w:t>Preuve : Séries et conclusions identifiables en niveaux de gris et dans l'équivalent textuel.</w:t>
+      </w:r>
+    </w:p>
+    <w:p>
+      <w:pPr>
         <w:pStyle w:val="Heading3"/>
       </w:pPr>
       <w:r>
@@ -1194,7 +1320,7 @@
         <w:drawing>
           <wp:inline xmlns:a="http://schemas.openxmlformats.org/drawingml/2006/main" xmlns:pic="http://schemas.openxmlformats.org/drawingml/2006/picture">
             <wp:extent cx="4114800" cy="2468880"/>
-            <wp:docPr id="4" name="Picture 4" descr="Graphique d'évolution du trafic web T1 2025 : visiteurs uniques en hausse de 12 %, pages vues +11 %, taux de rebond en baisse de 4 points." title="Trafic web T1 2025"/>
+            <wp:docPr id="4" name="Picture 4" descr="T4 2024 puis T1 2025 : accès directs, 18 200 puis 20 400 (+12 %) ; moteurs de recherche, 21 000 puis 23 400 (+11 %) ; sites référents, 6 000 puis 6 800 (+13 %)." title="Trafic web T1 2025"/>
             <wp:cNvGraphicFramePr>
               <a:graphicFrameLocks noChangeAspect="1"/>
             </wp:cNvGraphicFramePr>
@@ -1226,13 +1352,50 @@
       </w:r>
     </w:p>
     <w:p>
+      <w:pPr>
+        <w:pStyle w:val="Heading2"/>
+        <w:numPr>
+          <w:ilvl w:val="1"/>
+          <w:numId w:val="10"/>
+        </w:numPr>
+      </w:pPr>
       <w:r>
-        <w:rPr>
-          <w:rFonts w:ascii="Arial" w:hAnsi="Arial"/>
-          <w:sz w:val="22"/>
-          <w:lang w:val="en-US"/>
-        </w:rPr>
-        <w:t>The quarterly report is available upon request. Please contact the communication department for further details.</w:t>
+        <w:t>P-14 - Structurer un tableau de données simple</w:t>
+      </w:r>
+    </w:p>
+    <w:p>
+      <w:r>
+        <w:t>Problème : Un tableau de données cumule en-tête non identifié, fusion et ligne fractionnable.</w:t>
+      </w:r>
+    </w:p>
+    <w:p>
+      <w:r>
+        <w:t>Pourquoi : Les relations entre en-têtes et cellules restent compréhensibles et navigables.</w:t>
+      </w:r>
+    </w:p>
+    <w:p>
+      <w:r>
+        <w:t>Règle : Utiliser un tableau de données titré, sans fusion, imbrication, fractionnement de ligne ni usage de mise en page, avec en-tête identifié et répété.</w:t>
+      </w:r>
+    </w:p>
+    <w:p>
+      <w:r>
+        <w:t>Dans Word : Outils de tableau &gt; Disposition pour défusionner ; Propriétés du tableau pour répéter l'en-tête et interdire le fractionnement des lignes.</w:t>
+      </w:r>
+    </w:p>
+    <w:p>
+      <w:r>
+        <w:t>Dans LibreOffice Writer : Tableau &gt; Propriétés pour simplifier la grille, répéter les premières lignes et éviter le fractionnement.</w:t>
+      </w:r>
+    </w:p>
+    <w:p>
+      <w:r>
+        <w:t>À faire : Simplifier la structure, identifier l'en-tête et régler sa répétition ainsi que les lignes.</w:t>
+      </w:r>
+    </w:p>
+    <w:p>
+      <w:r>
+        <w:t>Preuve : XML sans fusion ni imbrication et relations de cellules vérifiées à la lecture.</w:t>
       </w:r>
     </w:p>
     <w:p>
@@ -1241,6 +1404,11 @@
       </w:pPr>
       <w:r>
         <w:t>Répartition par service</w:t>
+      </w:r>
+    </w:p>
+    <w:p>
+      <w:r>
+        <w:t>Périmètre : Direction des affaires juridiques.</w:t>
       </w:r>
     </w:p>
     <w:tbl>
@@ -1257,7 +1425,8 @@
       </w:tblGrid>
       <w:tr>
         <w:trPr>
-          <w:tblHeader val="true"/>
+          <w:tblHeader w:val="true"/>
+          <w:cantSplit w:val="true"/>
         </w:trPr>
         <w:tc>
           <w:tcPr>
@@ -1306,6 +1475,9 @@
         </w:tc>
       </w:tr>
       <w:tr>
+        <w:trPr>
+          <w:cantSplit w:val="true"/>
+        </w:trPr>
         <w:tc>
           <w:tcPr>
             <w:tcW w:type="dxa" w:w="2880"/>
@@ -1350,6 +1522,9 @@
         </w:tc>
       </w:tr>
       <w:tr>
+        <w:trPr>
+          <w:cantSplit w:val="true"/>
+        </w:trPr>
         <w:tc>
           <w:tcPr>
             <w:tcW w:type="dxa" w:w="2880"/>
@@ -1395,6 +1570,16 @@
       </w:tr>
     </w:tbl>
     <w:p>
+      <w:r>
+        <w:rPr>
+          <w:rFonts w:ascii="Arial" w:hAnsi="Arial"/>
+          <w:sz w:val="22"/>
+          <w:lang w:val="en-US"/>
+        </w:rPr>
+        <w:t>The quarterly report is available upon request. Please contact the communication department for further details.</w:t>
+      </w:r>
+    </w:p>
+    <w:p>
       <w:pPr>
         <w:pStyle w:val="Heading2"/>
       </w:pPr>
@@ -1403,16 +1588,6 @@
           <w:caps/>
         </w:rPr>
         <w:t>Annexes</w:t>
-      </w:r>
-    </w:p>
-    <w:p>
-      <w:r>
-        <w:rPr>
-          <w:rFonts w:ascii="Arial" w:hAnsi="Arial"/>
-          <w:color w:val="595959"/>
-          <w:sz w:val="18"/>
-        </w:rPr>
-        <w:t>Note : les données sont provisoires et susceptibles d'ajustements lors de la consolidation finale.</w:t>
       </w:r>
     </w:p>
     <w:sectPr>

</xml_diff>

<commit_message>
TP Sami : migration de la station 4
</commit_message>
<xml_diff>
--- a/_source/tp-doc-accessible.docx
+++ b/_source/tp-doc-accessible.docx
@@ -150,7 +150,7 @@
       <w:r>
         <w:rPr>
           <w:color w:val="808080"/>
-          <w:sz w:val="20"/>
+          <w:sz w:val="24"/>
         </w:rPr>
         <w:t>(Table des matières - mettre à jour avec F9)</w:t>
       </w:r>
@@ -211,7 +211,7 @@
           <w:rFonts w:ascii="Arial" w:hAnsi="Arial"/>
           <w:b/>
           <w:color w:val="C00000"/>
-          <w:sz w:val="22"/>
+          <w:sz w:val="24"/>
         </w:rPr>
         <w:t>Urgent - Retour attendu avant le 30 juin 2025</w:t>
       </w:r>
@@ -256,7 +256,7 @@
               <w:rPr>
                 <w:rFonts w:ascii="Arial" w:hAnsi="Arial"/>
                 <w:b/>
-                <w:sz w:val="20"/>
+                <w:sz w:val="24"/>
               </w:rPr>
               <w:t>Indicateur</w:t>
             </w:r>
@@ -271,7 +271,7 @@
               <w:rPr>
                 <w:rFonts w:ascii="Arial" w:hAnsi="Arial"/>
                 <w:b/>
-                <w:sz w:val="20"/>
+                <w:sz w:val="24"/>
               </w:rPr>
               <w:t>T4 2024</w:t>
             </w:r>
@@ -286,7 +286,7 @@
               <w:rPr>
                 <w:rFonts w:ascii="Arial" w:hAnsi="Arial"/>
                 <w:b/>
-                <w:sz w:val="20"/>
+                <w:sz w:val="24"/>
               </w:rPr>
               <w:t>T1 2025</w:t>
             </w:r>
@@ -301,7 +301,7 @@
               <w:rPr>
                 <w:rFonts w:ascii="Arial" w:hAnsi="Arial"/>
                 <w:b/>
-                <w:sz w:val="20"/>
+                <w:sz w:val="24"/>
               </w:rPr>
               <w:t>Évolution</w:t>
             </w:r>
@@ -320,7 +320,7 @@
             <w:r>
               <w:rPr>
                 <w:rFonts w:ascii="Arial" w:hAnsi="Arial"/>
-                <w:sz w:val="20"/>
+                <w:sz w:val="24"/>
               </w:rPr>
               <w:t>Visiteurs uniques</w:t>
             </w:r>
@@ -334,7 +334,7 @@
             <w:r>
               <w:rPr>
                 <w:rFonts w:ascii="Arial" w:hAnsi="Arial"/>
-                <w:sz w:val="20"/>
+                <w:sz w:val="24"/>
               </w:rPr>
               <w:t>45 200</w:t>
             </w:r>
@@ -348,7 +348,7 @@
             <w:r>
               <w:rPr>
                 <w:rFonts w:ascii="Arial" w:hAnsi="Arial"/>
-                <w:sz w:val="20"/>
+                <w:sz w:val="24"/>
               </w:rPr>
               <w:t>50 600</w:t>
             </w:r>
@@ -362,7 +362,7 @@
             <w:r>
               <w:rPr>
                 <w:rFonts w:ascii="Arial" w:hAnsi="Arial"/>
-                <w:sz w:val="20"/>
+                <w:sz w:val="24"/>
               </w:rPr>
               <w:t>+12 %</w:t>
             </w:r>
@@ -381,7 +381,7 @@
             <w:r>
               <w:rPr>
                 <w:rFonts w:ascii="Arial" w:hAnsi="Arial"/>
-                <w:sz w:val="20"/>
+                <w:sz w:val="24"/>
               </w:rPr>
               <w:t>Pages vues</w:t>
             </w:r>
@@ -395,7 +395,7 @@
             <w:r>
               <w:rPr>
                 <w:rFonts w:ascii="Arial" w:hAnsi="Arial"/>
-                <w:sz w:val="20"/>
+                <w:sz w:val="24"/>
               </w:rPr>
               <w:t>128 000</w:t>
             </w:r>
@@ -409,7 +409,7 @@
             <w:r>
               <w:rPr>
                 <w:rFonts w:ascii="Arial" w:hAnsi="Arial"/>
-                <w:sz w:val="20"/>
+                <w:sz w:val="24"/>
               </w:rPr>
               <w:t>142 000</w:t>
             </w:r>
@@ -423,7 +423,7 @@
             <w:r>
               <w:rPr>
                 <w:rFonts w:ascii="Arial" w:hAnsi="Arial"/>
-                <w:sz w:val="20"/>
+                <w:sz w:val="24"/>
               </w:rPr>
               <w:t>+11 %</w:t>
             </w:r>
@@ -442,7 +442,7 @@
             <w:r>
               <w:rPr>
                 <w:rFonts w:ascii="Arial" w:hAnsi="Arial"/>
-                <w:sz w:val="20"/>
+                <w:sz w:val="24"/>
               </w:rPr>
               <w:t>Taux de rebond</w:t>
             </w:r>
@@ -456,7 +456,7 @@
             <w:r>
               <w:rPr>
                 <w:rFonts w:ascii="Arial" w:hAnsi="Arial"/>
-                <w:sz w:val="20"/>
+                <w:sz w:val="24"/>
               </w:rPr>
               <w:t>42 %</w:t>
             </w:r>
@@ -470,7 +470,7 @@
             <w:r>
               <w:rPr>
                 <w:rFonts w:ascii="Arial" w:hAnsi="Arial"/>
-                <w:sz w:val="20"/>
+                <w:sz w:val="24"/>
               </w:rPr>
               <w:t>38 %</w:t>
             </w:r>
@@ -484,7 +484,7 @@
             <w:r>
               <w:rPr>
                 <w:rFonts w:ascii="Arial" w:hAnsi="Arial"/>
-                <w:sz w:val="20"/>
+                <w:sz w:val="24"/>
               </w:rPr>
               <w:t>-4 pts</w:t>
             </w:r>
@@ -912,7 +912,7 @@
       <w:r>
         <w:rPr>
           <w:rFonts w:ascii="Arial" w:hAnsi="Arial"/>
-          <w:sz w:val="20"/>
+          <w:sz w:val="24"/>
         </w:rPr>
         <w:t>La Direction des affaires juridiques comprend 4 bureaux : le Bureau du droit public, le Bureau du droit social, le Bureau de la communication et le Bureau des affaires internationales. Chaque bureau est rattaché directement à la direction.</w:t>
       </w:r>
@@ -1063,7 +1063,7 @@
       <w:r>
         <w:rPr>
           <w:rFonts w:ascii="Arial" w:hAnsi="Arial"/>
-          <w:sz w:val="22"/>
+          <w:sz w:val="24"/>
         </w:rPr>
         <w:t>Avis important : les indicateurs du T2 2025 seront transmis avant le 15 septembre 2025.</w:t>
       </w:r>
@@ -1183,7 +1183,7 @@
       <w:r>
         <w:rPr>
           <w:rFonts w:ascii="Arial" w:hAnsi="Arial"/>
-          <w:sz w:val="22"/>
+          <w:sz w:val="24"/>
         </w:rPr>
         <w:t>Document confidentiel</w:t>
       </w:r>
@@ -1252,7 +1252,7 @@
         <w:rPr>
           <w:rFonts w:ascii="Arial" w:hAnsi="Arial"/>
           <w:color w:val="595959"/>
-          <w:sz w:val="22"/>
+          <w:sz w:val="24"/>
         </w:rPr>
         <w:t>Information complémentaire : résultats provisoires.</w:t>
       </w:r>
@@ -1437,7 +1437,7 @@
               <w:rPr>
                 <w:rFonts w:ascii="Arial" w:hAnsi="Arial"/>
                 <w:b/>
-                <w:sz w:val="20"/>
+                <w:sz w:val="24"/>
               </w:rPr>
               <w:t>Service</w:t>
             </w:r>
@@ -1452,7 +1452,7 @@
               <w:rPr>
                 <w:rFonts w:ascii="Arial" w:hAnsi="Arial"/>
                 <w:b/>
-                <w:sz w:val="20"/>
+                <w:sz w:val="24"/>
               </w:rPr>
               <w:t>Effectif</w:t>
             </w:r>
@@ -1467,7 +1467,7 @@
               <w:rPr>
                 <w:rFonts w:ascii="Arial" w:hAnsi="Arial"/>
                 <w:b/>
-                <w:sz w:val="20"/>
+                <w:sz w:val="24"/>
               </w:rPr>
               <w:t>Budget</w:t>
             </w:r>
@@ -1486,7 +1486,7 @@
             <w:r>
               <w:rPr>
                 <w:rFonts w:ascii="Arial" w:hAnsi="Arial"/>
-                <w:sz w:val="20"/>
+                <w:sz w:val="24"/>
               </w:rPr>
               <w:t>Communication</w:t>
             </w:r>
@@ -1500,7 +1500,7 @@
             <w:r>
               <w:rPr>
                 <w:rFonts w:ascii="Arial" w:hAnsi="Arial"/>
-                <w:sz w:val="20"/>
+                <w:sz w:val="24"/>
               </w:rPr>
               <w:t>12</w:t>
             </w:r>
@@ -1514,7 +1514,7 @@
             <w:r>
               <w:rPr>
                 <w:rFonts w:ascii="Arial" w:hAnsi="Arial"/>
-                <w:sz w:val="20"/>
+                <w:sz w:val="24"/>
               </w:rPr>
               <w:t>45 000</w:t>
             </w:r>
@@ -1533,7 +1533,7 @@
             <w:r>
               <w:rPr>
                 <w:rFonts w:ascii="Arial" w:hAnsi="Arial"/>
-                <w:sz w:val="20"/>
+                <w:sz w:val="24"/>
               </w:rPr>
               <w:t>Juridique</w:t>
             </w:r>
@@ -1547,7 +1547,7 @@
             <w:r>
               <w:rPr>
                 <w:rFonts w:ascii="Arial" w:hAnsi="Arial"/>
-                <w:sz w:val="20"/>
+                <w:sz w:val="24"/>
               </w:rPr>
               <w:t>28</w:t>
             </w:r>
@@ -1561,7 +1561,7 @@
             <w:r>
               <w:rPr>
                 <w:rFonts w:ascii="Arial" w:hAnsi="Arial"/>
-                <w:sz w:val="20"/>
+                <w:sz w:val="24"/>
               </w:rPr>
               <w:t>120 000</w:t>
             </w:r>
@@ -1570,10 +1570,69 @@
       </w:tr>
     </w:tbl>
     <w:p>
+      <w:pPr>
+        <w:pStyle w:val="Heading1"/>
+        <w:numPr>
+          <w:ilvl w:val="0"/>
+          <w:numId w:val="10"/>
+        </w:numPr>
+      </w:pPr>
+      <w:r>
+        <w:t>Régler langues et lisibilité</w:t>
+      </w:r>
+    </w:p>
+    <w:p>
+      <w:pPr>
+        <w:pStyle w:val="Heading2"/>
+        <w:numPr>
+          <w:ilvl w:val="1"/>
+          <w:numId w:val="10"/>
+        </w:numPr>
+      </w:pPr>
+      <w:r>
+        <w:t>P-15 - Définir les langues du document et des passages</w:t>
+      </w:r>
+    </w:p>
+    <w:p>
+      <w:r>
+        <w:t>Problème : Le document et une expression étrangère possèdent une langue absente ou incohérente.</w:t>
+      </w:r>
+    </w:p>
+    <w:p>
+      <w:r>
+        <w:t>Pourquoi : La synthèse vocale emploie la prononciation appropriée.</w:t>
+      </w:r>
+    </w:p>
+    <w:p>
+      <w:r>
+        <w:t>Règle : Définir la langue principale puis baliser chaque passage dans une autre langue.</w:t>
+      </w:r>
+    </w:p>
+    <w:p>
+      <w:r>
+        <w:t>Dans Word : Révision &gt; Langue &gt; Définir la langue de vérification pour le document puis pour le passage sélectionné.</w:t>
+      </w:r>
+    </w:p>
+    <w:p>
+      <w:r>
+        <w:t>Dans LibreOffice Writer : Outils &gt; Langue pour tout le texte, puis langue du caractère pour le passage sélectionné.</w:t>
+      </w:r>
+    </w:p>
+    <w:p>
+      <w:r>
+        <w:t>À faire : Régler la langue principale puis celle du passage étranger.</w:t>
+      </w:r>
+    </w:p>
+    <w:p>
+      <w:r>
+        <w:t>Preuve : Propriétés et XML de langue cohérents</w:t>
+      </w:r>
+    </w:p>
+    <w:p>
       <w:r>
         <w:rPr>
           <w:rFonts w:ascii="Arial" w:hAnsi="Arial"/>
-          <w:sz w:val="22"/>
+          <w:sz w:val="24"/>
           <w:lang w:val="en-US"/>
         </w:rPr>
         <w:t>The quarterly report is available upon request. Please contact the communication department for further details.</w:t>
@@ -1582,12 +1641,163 @@
     <w:p>
       <w:pPr>
         <w:pStyle w:val="Heading2"/>
+        <w:numPr>
+          <w:ilvl w:val="1"/>
+          <w:numId w:val="10"/>
+        </w:numPr>
+      </w:pPr>
+      <w:r>
+        <w:t>P-16 - Régler une typographie lisible par les styles</w:t>
+      </w:r>
+    </w:p>
+    <w:p>
+      <w:r>
+        <w:t>Problème : Le corps utilise une police, une taille, un interligne ou un alignement qui réduit la lisibilité.</w:t>
+      </w:r>
+    </w:p>
+    <w:p>
+      <w:r>
+        <w:t>Pourquoi : Le texte demande moins d'effort de lecture et reste homogène.</w:t>
+      </w:r>
+    </w:p>
+    <w:p>
+      <w:r>
+        <w:t>Règle : Employer une police sans sérif, au moins 12 points, un interligne d'au moins 1,15 et un alignement à gauche.</w:t>
+      </w:r>
+    </w:p>
+    <w:p>
+      <w:r>
+        <w:t>Dans Word : Accueil &gt; Styles &gt; Modifier le style Normal, puis régler police, taille, alignement et paragraphe.</w:t>
+      </w:r>
+    </w:p>
+    <w:p>
+      <w:r>
+        <w:t>Dans LibreOffice Writer : Styles &gt; Gérer les styles &gt; modifier Style de paragraphe par défaut, puis régler police et retraits et espacement.</w:t>
+      </w:r>
+    </w:p>
+    <w:p>
+      <w:r>
+        <w:t>À faire : Modifier le style du corps plutôt que corriger les paragraphes un par un.</w:t>
+      </w:r>
+    </w:p>
+    <w:p>
+      <w:r>
+        <w:t>Preuve : Propriétés typographiques contrôlées dans le DOCX et lisibilité relue.</w:t>
+      </w:r>
+    </w:p>
+    <w:p>
+      <w:r>
+        <w:t>La mise en forme du corps du document est pilotée par le style Normal.</w:t>
+      </w:r>
+    </w:p>
+    <w:p>
+      <w:pPr>
+        <w:pStyle w:val="Heading2"/>
+        <w:numPr>
+          <w:ilvl w:val="1"/>
+          <w:numId w:val="10"/>
+        </w:numPr>
+      </w:pPr>
+      <w:r>
+        <w:t>P-17 - Appliquer la casse par la mise en forme</w:t>
+      </w:r>
+    </w:p>
+    <w:p>
+      <w:r>
+        <w:t>Problème : Un texte est saisi directement en capitales sans accents.</w:t>
+      </w:r>
+    </w:p>
+    <w:p>
+      <w:r>
+        <w:t>Pourquoi : Les accents, la recherche et la restitution du texte restent corrects.</w:t>
+      </w:r>
+    </w:p>
+    <w:p>
+      <w:r>
+        <w:t>Règle : Saisir les mots normalement avec leurs accents puis appliquer l'apparence en majuscules par le style.</w:t>
+      </w:r>
+    </w:p>
+    <w:p>
+      <w:r>
+        <w:t>Dans Word : Corriger le texte, puis Police &gt; Effets &gt; Majuscules si cette apparence est nécessaire.</w:t>
+      </w:r>
+    </w:p>
+    <w:p>
+      <w:r>
+        <w:t>Dans LibreOffice Writer : Corriger le texte, puis Format &gt; Caractère &gt; Effets de caractères &gt; Majuscules.</w:t>
+      </w:r>
+    </w:p>
+    <w:p>
+      <w:r>
+        <w:t>À faire : Rétablir la saisie normale et appliquer la casse visuelle par la mise en forme.</w:t>
+      </w:r>
+    </w:p>
+    <w:p>
+      <w:r>
+        <w:t>Preuve : Texte XML accentué et contrôle visuel de la casse.</w:t>
+      </w:r>
+    </w:p>
+    <w:p>
+      <w:pPr>
+        <w:pStyle w:val="Heading3"/>
       </w:pPr>
       <w:r>
         <w:rPr>
           <w:caps/>
         </w:rPr>
-        <w:t>Annexes</w:t>
+        <w:t>Annexes - accessibilité</w:t>
+      </w:r>
+    </w:p>
+    <w:p>
+      <w:pPr>
+        <w:pStyle w:val="Heading2"/>
+        <w:numPr>
+          <w:ilvl w:val="1"/>
+          <w:numId w:val="10"/>
+        </w:numPr>
+      </w:pPr>
+      <w:r>
+        <w:t>P-18 - Développer les sigles et vérifier les majuscules</w:t>
+      </w:r>
+    </w:p>
+    <w:p>
+      <w:r>
+        <w:t>Problème : Un acronyme n'est jamais développé et les mots en majuscules échappent à la vérification.</w:t>
+      </w:r>
+    </w:p>
+    <w:p>
+      <w:r>
+        <w:t>Pourquoi : Les termes abrégés deviennent compréhensibles et les erreurs restent détectables.</w:t>
+      </w:r>
+    </w:p>
+    <w:p>
+      <w:r>
+        <w:t>Règle : Développer chaque sigle ou acronyme à sa première occurrence et inclure les mots en majuscules dans la vérification orthographique.</w:t>
+      </w:r>
+    </w:p>
+    <w:p>
+      <w:r>
+        <w:t>Dans Word : Développer le terme dans le corps, puis Fichier &gt; Options &gt; Vérification et décocher Ignorer les mots en MAJUSCULES.</w:t>
+      </w:r>
+    </w:p>
+    <w:p>
+      <w:r>
+        <w:t>Dans LibreOffice Writer : Développer le terme dans le corps, puis Outils &gt; Options &gt; Paramètres linguistiques &gt; Linguistique et vérifier les options de contrôle.</w:t>
+      </w:r>
+    </w:p>
+    <w:p>
+      <w:r>
+        <w:t>À faire : Développer la première occurrence et activer l'option de vérification correspondante.</w:t>
+      </w:r>
+    </w:p>
+    <w:p>
+      <w:r>
+        <w:t>Preuve : Première occurrence compréhensible et faute témoin en majuscules détectée.</w:t>
+      </w:r>
+    </w:p>
+    <w:p>
+      <w:r>
+        <w:t>Le Référentiel général d’amélioration de l’accessibilité (RGAA) structure le contrôle des documents numériques.</w:t>
       </w:r>
     </w:p>
     <w:sectPr>
@@ -1612,7 +1822,7 @@
       <w:rPr>
         <w:rFonts w:ascii="Arial" w:hAnsi="Arial"/>
         <w:color w:val="000000"/>
-        <w:sz w:val="18"/>
+        <w:sz w:val="24"/>
       </w:rPr>
       <w:t>Rapport trimestriel - Bilan T1 2025</w:t>
     </w:r>
@@ -1620,7 +1830,7 @@
       <w:rPr>
         <w:rFonts w:ascii="Arial" w:hAnsi="Arial"/>
         <w:color w:val="000000"/>
-        <w:sz w:val="18"/>
+        <w:sz w:val="24"/>
       </w:rPr>
       <w:t xml:space="preserve"> - </w:t>
     </w:r>
@@ -1628,7 +1838,7 @@
       <w:rPr>
         <w:rFonts w:ascii="Arial" w:hAnsi="Arial"/>
         <w:color w:val="000000"/>
-        <w:sz w:val="18"/>
+        <w:sz w:val="24"/>
       </w:rPr>
       <w:t xml:space="preserve">Page </w:t>
     </w:r>
@@ -1636,7 +1846,7 @@
       <w:rPr>
         <w:rFonts w:ascii="Arial" w:hAnsi="Arial"/>
         <w:color w:val="000000"/>
-        <w:sz w:val="18"/>
+        <w:sz w:val="24"/>
       </w:rPr>
       <w:fldChar w:fldCharType="begin"/>
     </w:r>
@@ -1644,7 +1854,7 @@
       <w:rPr>
         <w:rFonts w:ascii="Arial" w:hAnsi="Arial"/>
         <w:color w:val="000000"/>
-        <w:sz w:val="18"/>
+        <w:sz w:val="24"/>
       </w:rPr>
       <w:instrText xml:space="preserve"> PAGE </w:instrText>
     </w:r>
@@ -1652,7 +1862,7 @@
       <w:rPr>
         <w:rFonts w:ascii="Arial" w:hAnsi="Arial"/>
         <w:color w:val="000000"/>
-        <w:sz w:val="18"/>
+        <w:sz w:val="24"/>
       </w:rPr>
       <w:fldChar w:fldCharType="separate"/>
     </w:r>
@@ -1660,7 +1870,7 @@
       <w:rPr>
         <w:rFonts w:ascii="Arial" w:hAnsi="Arial"/>
         <w:color w:val="000000"/>
-        <w:sz w:val="18"/>
+        <w:sz w:val="24"/>
       </w:rPr>
       <w:t>1</w:t>
     </w:r>
@@ -1668,7 +1878,7 @@
       <w:rPr>
         <w:rFonts w:ascii="Arial" w:hAnsi="Arial"/>
         <w:color w:val="000000"/>
-        <w:sz w:val="18"/>
+        <w:sz w:val="24"/>
       </w:rPr>
       <w:fldChar w:fldCharType="end"/>
     </w:r>
@@ -1676,7 +1886,7 @@
       <w:rPr>
         <w:rFonts w:ascii="Arial" w:hAnsi="Arial"/>
         <w:color w:val="000000"/>
-        <w:sz w:val="18"/>
+        <w:sz w:val="24"/>
       </w:rPr>
       <w:t xml:space="preserve"> / </w:t>
     </w:r>
@@ -1684,7 +1894,7 @@
       <w:rPr>
         <w:rFonts w:ascii="Arial" w:hAnsi="Arial"/>
         <w:color w:val="000000"/>
-        <w:sz w:val="18"/>
+        <w:sz w:val="24"/>
       </w:rPr>
       <w:fldChar w:fldCharType="begin"/>
     </w:r>
@@ -1692,7 +1902,7 @@
       <w:rPr>
         <w:rFonts w:ascii="Arial" w:hAnsi="Arial"/>
         <w:color w:val="000000"/>
-        <w:sz w:val="18"/>
+        <w:sz w:val="24"/>
       </w:rPr>
       <w:instrText xml:space="preserve"> NUMPAGES </w:instrText>
     </w:r>
@@ -1700,7 +1910,7 @@
       <w:rPr>
         <w:rFonts w:ascii="Arial" w:hAnsi="Arial"/>
         <w:color w:val="000000"/>
-        <w:sz w:val="18"/>
+        <w:sz w:val="24"/>
       </w:rPr>
       <w:fldChar w:fldCharType="separate"/>
     </w:r>
@@ -1708,7 +1918,7 @@
       <w:rPr>
         <w:rFonts w:ascii="Arial" w:hAnsi="Arial"/>
         <w:color w:val="000000"/>
-        <w:sz w:val="18"/>
+        <w:sz w:val="24"/>
       </w:rPr>
       <w:t>1</w:t>
     </w:r>
@@ -1716,7 +1926,7 @@
       <w:rPr>
         <w:rFonts w:ascii="Arial" w:hAnsi="Arial"/>
         <w:color w:val="000000"/>
-        <w:sz w:val="18"/>
+        <w:sz w:val="24"/>
       </w:rPr>
       <w:fldChar w:fldCharType="end"/>
     </w:r>
@@ -1735,7 +1945,7 @@
       <w:rPr>
         <w:rFonts w:ascii="Arial" w:hAnsi="Arial"/>
         <w:color w:val="000000"/>
-        <w:sz w:val="18"/>
+        <w:sz w:val="24"/>
       </w:rPr>
       <w:t>Direction des affaires juridiques - Rapport trimestriel T1 2025</w:t>
     </w:r>
@@ -2137,11 +2347,12 @@
     <w:qFormat/>
     <w:rsid w:val="00FC693F"/>
     <w:pPr>
+      <w:spacing w:line="276" w:lineRule="auto"/>
       <w:jc w:val="left"/>
     </w:pPr>
     <w:rPr>
       <w:rFonts w:ascii="Arial" w:hAnsi="Arial"/>
-      <w:sz w:val="22"/>
+      <w:sz w:val="24"/>
       <w:lang w:val="fr-FR" w:eastAsia="fr-FR" w:bidi="fr-FR"/>
     </w:rPr>
   </w:style>
@@ -2161,7 +2372,7 @@
     </w:pPr>
     <w:rPr>
       <w:rFonts w:ascii="Arial" w:hAnsi="Arial"/>
-      <w:sz w:val="18"/>
+      <w:sz w:val="24"/>
     </w:rPr>
   </w:style>
   <w:style w:type="character" w:customStyle="1" w:styleId="HeaderChar">
@@ -2214,6 +2425,7 @@
       <w:color w:val="000091"/>
       <w:sz w:val="32"/>
       <w:szCs w:val="28"/>
+      <w:lang w:val="fr-FR" w:eastAsia="fr-FR" w:bidi="fr-FR"/>
     </w:rPr>
   </w:style>
   <w:style w:type="paragraph" w:styleId="Heading2">
@@ -2238,6 +2450,7 @@
       <w:color w:val="000091"/>
       <w:sz w:val="28"/>
       <w:szCs w:val="26"/>
+      <w:lang w:val="fr-FR" w:eastAsia="fr-FR" w:bidi="fr-FR"/>
     </w:rPr>
   </w:style>
   <w:style w:type="paragraph" w:styleId="Heading3">
@@ -2261,6 +2474,7 @@
       <w:bCs/>
       <w:color w:val="000091"/>
       <w:sz w:val="24"/>
+      <w:lang w:val="fr-FR" w:eastAsia="fr-FR" w:bidi="fr-FR"/>
     </w:rPr>
   </w:style>
   <w:style w:type="paragraph" w:styleId="Heading4">
@@ -2286,6 +2500,7 @@
       <w:i/>
       <w:iCs/>
       <w:color w:val="4F81BD" w:themeColor="accent1"/>
+      <w:lang w:val="fr-FR" w:eastAsia="fr-FR" w:bidi="fr-FR"/>
     </w:rPr>
   </w:style>
   <w:style w:type="paragraph" w:styleId="Heading5">
@@ -2504,6 +2719,7 @@
       <w:kern w:val="28"/>
       <w:sz w:val="52"/>
       <w:szCs w:val="52"/>
+      <w:lang w:val="fr-FR" w:eastAsia="fr-FR" w:bidi="fr-FR"/>
     </w:rPr>
   </w:style>
   <w:style w:type="character" w:customStyle="1" w:styleId="TitleChar">
@@ -2678,6 +2894,9 @@
       </w:numPr>
       <w:contextualSpacing/>
     </w:pPr>
+    <w:rPr>
+      <w:lang w:val="fr-FR" w:eastAsia="fr-FR" w:bidi="fr-FR"/>
+    </w:rPr>
   </w:style>
   <w:style w:type="paragraph" w:styleId="ListBullet2">
     <w:name w:val="List Bullet 2"/>
@@ -2717,6 +2936,9 @@
       </w:numPr>
       <w:contextualSpacing/>
     </w:pPr>
+    <w:rPr>
+      <w:lang w:val="fr-FR" w:eastAsia="fr-FR" w:bidi="fr-FR"/>
+    </w:rPr>
   </w:style>
   <w:style w:type="paragraph" w:styleId="ListNumber2">
     <w:name w:val="List Number 2"/>

</xml_diff>

<commit_message>
TP Sami : finalisation du prototype DOCX
</commit_message>
<xml_diff>
--- a/_source/tp-doc-accessible.docx
+++ b/_source/tp-doc-accessible.docx
@@ -13,6 +13,8 @@
     <w:p>
       <w:pPr>
         <w:pStyle w:val="Heading1"/>
+        <w:keepNext/>
+        <w:pageBreakBefore/>
         <w:numPr>
           <w:ilvl w:val="0"/>
           <w:numId w:val="10"/>
@@ -25,6 +27,7 @@
     <w:p>
       <w:pPr>
         <w:pStyle w:val="Heading2"/>
+        <w:keepNext/>
         <w:numPr>
           <w:ilvl w:val="1"/>
           <w:numId w:val="10"/>
@@ -72,6 +75,8 @@
     <w:p>
       <w:pPr>
         <w:pStyle w:val="Heading2"/>
+        <w:keepNext/>
+        <w:pageBreakBefore/>
         <w:numPr>
           <w:ilvl w:val="1"/>
           <w:numId w:val="10"/>
@@ -126,7 +131,7 @@
     </w:p>
     <w:p>
       <w:r>
-        <w:t>Ce rapport trimestriel présente les résultats de communication numérique de la Direction des affaires juridiques pour le premier trimestre 2025. Il couvre les principaux indicateurs de performance de nos canaux digitaux.</w:t>
+        <w:t>Ce guide pratique présente les principales vérifications à effectuer pour rendre un document Word accessible. Il associe chaque règle à une manipulation et à une preuve de correction.</w:t>
       </w:r>
     </w:p>
     <w:p>
@@ -161,6 +166,8 @@
     <w:p>
       <w:pPr>
         <w:pStyle w:val="Heading2"/>
+        <w:keepNext/>
+        <w:pageBreakBefore/>
         <w:numPr>
           <w:ilvl w:val="1"/>
           <w:numId w:val="10"/>
@@ -495,6 +502,8 @@
     <w:p>
       <w:pPr>
         <w:pStyle w:val="Heading2"/>
+        <w:keepNext/>
+        <w:pageBreakBefore/>
         <w:numPr>
           <w:ilvl w:val="1"/>
           <w:numId w:val="10"/>
@@ -600,6 +609,8 @@
     <w:p>
       <w:pPr>
         <w:pStyle w:val="Heading2"/>
+        <w:keepNext/>
+        <w:pageBreakBefore/>
         <w:numPr>
           <w:ilvl w:val="1"/>
           <w:numId w:val="10"/>
@@ -727,6 +738,8 @@
     <w:p>
       <w:pPr>
         <w:pStyle w:val="Heading1"/>
+        <w:keepNext/>
+        <w:pageBreakBefore/>
         <w:numPr>
           <w:ilvl w:val="0"/>
           <w:numId w:val="10"/>
@@ -739,6 +752,7 @@
     <w:p>
       <w:pPr>
         <w:pStyle w:val="Heading2"/>
+        <w:keepNext/>
         <w:numPr>
           <w:ilvl w:val="1"/>
           <w:numId w:val="10"/>
@@ -825,6 +839,8 @@
     <w:p>
       <w:pPr>
         <w:pStyle w:val="Heading2"/>
+        <w:keepNext/>
+        <w:pageBreakBefore/>
         <w:numPr>
           <w:ilvl w:val="1"/>
           <w:numId w:val="10"/>
@@ -920,6 +936,8 @@
     <w:p>
       <w:pPr>
         <w:pStyle w:val="Heading2"/>
+        <w:keepNext/>
+        <w:pageBreakBefore/>
         <w:numPr>
           <w:ilvl w:val="1"/>
           <w:numId w:val="10"/>
@@ -1015,6 +1033,8 @@
     <w:p>
       <w:pPr>
         <w:pStyle w:val="Heading2"/>
+        <w:keepNext/>
+        <w:pageBreakBefore/>
         <w:numPr>
           <w:ilvl w:val="1"/>
           <w:numId w:val="10"/>
@@ -1071,6 +1091,8 @@
     <w:p>
       <w:pPr>
         <w:pStyle w:val="Heading2"/>
+        <w:keepNext/>
+        <w:pageBreakBefore/>
         <w:numPr>
           <w:ilvl w:val="1"/>
           <w:numId w:val="10"/>
@@ -1135,6 +1157,8 @@
     <w:p>
       <w:pPr>
         <w:pStyle w:val="Heading2"/>
+        <w:keepNext/>
+        <w:pageBreakBefore/>
         <w:numPr>
           <w:ilvl w:val="1"/>
           <w:numId w:val="10"/>
@@ -1191,6 +1215,8 @@
     <w:p>
       <w:pPr>
         <w:pStyle w:val="Heading1"/>
+        <w:keepNext/>
+        <w:pageBreakBefore/>
         <w:numPr>
           <w:ilvl w:val="0"/>
           <w:numId w:val="10"/>
@@ -1203,6 +1229,7 @@
     <w:p>
       <w:pPr>
         <w:pStyle w:val="Heading2"/>
+        <w:keepNext/>
         <w:numPr>
           <w:ilvl w:val="1"/>
           <w:numId w:val="10"/>
@@ -1260,6 +1287,8 @@
     <w:p>
       <w:pPr>
         <w:pStyle w:val="Heading2"/>
+        <w:keepNext/>
+        <w:pageBreakBefore/>
         <w:numPr>
           <w:ilvl w:val="1"/>
           <w:numId w:val="10"/>
@@ -1354,6 +1383,8 @@
     <w:p>
       <w:pPr>
         <w:pStyle w:val="Heading2"/>
+        <w:keepNext/>
+        <w:pageBreakBefore/>
         <w:numPr>
           <w:ilvl w:val="1"/>
           <w:numId w:val="10"/>
@@ -1572,6 +1603,8 @@
     <w:p>
       <w:pPr>
         <w:pStyle w:val="Heading1"/>
+        <w:keepNext/>
+        <w:pageBreakBefore/>
         <w:numPr>
           <w:ilvl w:val="0"/>
           <w:numId w:val="10"/>
@@ -1584,6 +1617,7 @@
     <w:p>
       <w:pPr>
         <w:pStyle w:val="Heading2"/>
+        <w:keepNext/>
         <w:numPr>
           <w:ilvl w:val="1"/>
           <w:numId w:val="10"/>
@@ -1641,6 +1675,8 @@
     <w:p>
       <w:pPr>
         <w:pStyle w:val="Heading2"/>
+        <w:keepNext/>
+        <w:pageBreakBefore/>
         <w:numPr>
           <w:ilvl w:val="1"/>
           <w:numId w:val="10"/>
@@ -1693,6 +1729,8 @@
     <w:p>
       <w:pPr>
         <w:pStyle w:val="Heading2"/>
+        <w:keepNext/>
+        <w:pageBreakBefore/>
         <w:numPr>
           <w:ilvl w:val="1"/>
           <w:numId w:val="10"/>
@@ -1751,6 +1789,8 @@
     <w:p>
       <w:pPr>
         <w:pStyle w:val="Heading2"/>
+        <w:keepNext/>
+        <w:pageBreakBefore/>
         <w:numPr>
           <w:ilvl w:val="1"/>
           <w:numId w:val="10"/>
@@ -1800,6 +1840,220 @@
         <w:t>Le Référentiel général d’amélioration de l’accessibilité (RGAA) structure le contrôle des documents numériques.</w:t>
       </w:r>
     </w:p>
+    <w:p>
+      <w:pPr>
+        <w:pStyle w:val="Heading1"/>
+        <w:keepNext/>
+        <w:pageBreakBefore/>
+        <w:numPr>
+          <w:ilvl w:val="0"/>
+          <w:numId w:val="10"/>
+        </w:numPr>
+      </w:pPr>
+      <w:r>
+        <w:t>Finaliser, vérifier, exporter et contrôler</w:t>
+      </w:r>
+    </w:p>
+    <w:p>
+      <w:pPr>
+        <w:pStyle w:val="Heading2"/>
+        <w:keepNext/>
+        <w:numPr>
+          <w:ilvl w:val="1"/>
+          <w:numId w:val="10"/>
+        </w:numPr>
+      </w:pPr>
+      <w:r>
+        <w:t>P-19 - Renseigner les propriétés et le nom du fichier</w:t>
+      </w:r>
+    </w:p>
+    <w:p>
+      <w:r>
+        <w:t>Problème : Les propriétés sont absentes et le nom du fichier ne décrit pas son contenu.</w:t>
+      </w:r>
+    </w:p>
+    <w:p>
+      <w:r>
+        <w:t>Pourquoi : Le document est identifiable dans les outils, les listes de fichiers et les technologies d'assistance.</w:t>
+      </w:r>
+    </w:p>
+    <w:p>
+      <w:r>
+        <w:t>Règle : Renseigner titre, auteur et langue puis enregistrer sous un nom descriptif.</w:t>
+      </w:r>
+    </w:p>
+    <w:p>
+      <w:r>
+        <w:t>Dans Word : Fichier &gt; Informations &gt; Propriétés &gt; Propriétés avancées, puis Fichier &gt; Enregistrer sous.</w:t>
+      </w:r>
+    </w:p>
+    <w:p>
+      <w:r>
+        <w:t>Dans LibreOffice Writer : Fichier &gt; Propriétés, puis Fichier &gt; Enregistrer sous.</w:t>
+      </w:r>
+    </w:p>
+    <w:p>
+      <w:r>
+        <w:t>À faire : Compléter les propriétés puis enregistrer une copie sous un nom descriptif.</w:t>
+      </w:r>
+    </w:p>
+    <w:p>
+      <w:r>
+        <w:t>Preuve : Métadonnées inspectées dans le DOCX et nom de sortie relu.</w:t>
+      </w:r>
+    </w:p>
+    <w:p>
+      <w:r>
+        <w:t>Document — propriétés : vérifiez le titre, l’auteur, la langue et le nom de votre copie de travail.</w:t>
+      </w:r>
+    </w:p>
+    <w:p>
+      <w:pPr>
+        <w:pStyle w:val="Heading2"/>
+        <w:keepNext/>
+        <w:pageBreakBefore/>
+        <w:numPr>
+          <w:ilvl w:val="1"/>
+          <w:numId w:val="10"/>
+        </w:numPr>
+      </w:pPr>
+      <w:r>
+        <w:t>P-20 - Exporter un PDF structuré</w:t>
+      </w:r>
+    </w:p>
+    <w:p>
+      <w:r>
+        <w:t>Problème : Cette étape de finalisation ne peut pas être prouvée par le DOCX seul.</w:t>
+      </w:r>
+    </w:p>
+    <w:p>
+      <w:r>
+        <w:t>Pourquoi : Le PDF conserve les propriétés, la structure et les accès issus des titres.</w:t>
+      </w:r>
+    </w:p>
+    <w:p>
+      <w:r>
+        <w:t>Règle : Exporter avec propriétés, balises de structure et signets générés depuis les titres.</w:t>
+      </w:r>
+    </w:p>
+    <w:p>
+      <w:r>
+        <w:t>Dans Word : Vérifier les propriétés dans Fichier &gt; Informations, puis Fichier &gt; Enregistrer sous ou Exporter &gt; PDF &gt; Options et activer les balises de structure ainsi que les signets issus des titres.</w:t>
+      </w:r>
+    </w:p>
+    <w:p>
+      <w:r>
+        <w:t>Dans LibreOffice Writer : Vérifier les propriétés dans Fichier &gt; Propriétés, puis Fichier &gt; Exporter vers &gt; Exporter au format PDF et activer PDF balisé ainsi que l'export des repères.</w:t>
+      </w:r>
+    </w:p>
+    <w:p>
+      <w:r>
+        <w:t>À faire : Exporter le DOCX corrigé en activant les options d'accessibilité prévues.</w:t>
+      </w:r>
+    </w:p>
+    <w:p>
+      <w:r>
+        <w:t>Preuve : Propriétés et structure inspectées dans le PDF</w:t>
+      </w:r>
+    </w:p>
+    <w:p>
+      <w:pPr>
+        <w:pStyle w:val="Heading2"/>
+        <w:keepNext/>
+        <w:pageBreakBefore/>
+        <w:numPr>
+          <w:ilvl w:val="1"/>
+          <w:numId w:val="10"/>
+        </w:numPr>
+      </w:pPr>
+      <w:r>
+        <w:t>C-01 - Utiliser le vérificateur d'accessibilité Word</w:t>
+      </w:r>
+    </w:p>
+    <w:p>
+      <w:r>
+        <w:t>Problème : Cette étape de finalisation ne peut pas être prouvée par le DOCX seul.</w:t>
+      </w:r>
+    </w:p>
+    <w:p>
+      <w:r>
+        <w:t>Pourquoi : L'outil repère certains défauts mais ne remplace pas le jugement humain.</w:t>
+      </w:r>
+    </w:p>
+    <w:p>
+      <w:r>
+        <w:t>Règle : Traiter les alertes pertinentes et expliquer toute alerte résiduelle ; viser zéro erreur sans en faire une preuve de conformité.</w:t>
+      </w:r>
+    </w:p>
+    <w:p>
+      <w:r>
+        <w:t>Dans Word : Révision &gt; Vérifier l'accessibilité, parcourir chaque résultat et utiliser les actions recommandées avec discernement.</w:t>
+      </w:r>
+    </w:p>
+    <w:p>
+      <w:r>
+        <w:t>Dans LibreOffice Writer : Outils &gt; Vérification de l'accessibilité, parcourir les résultats et vérifier manuellement les points non couverts.</w:t>
+      </w:r>
+    </w:p>
+    <w:p>
+      <w:r>
+        <w:t>À faire : Lancer le vérificateur, corriger les erreurs pertinentes et consigner les alertes restantes.</w:t>
+      </w:r>
+    </w:p>
+    <w:p>
+      <w:r>
+        <w:t>Preuve : Relevé du vérificateur conservé et alertes résiduelles justifiées.</w:t>
+      </w:r>
+    </w:p>
+    <w:p>
+      <w:pPr>
+        <w:pStyle w:val="Heading2"/>
+        <w:keepNext/>
+        <w:pageBreakBefore/>
+        <w:numPr>
+          <w:ilvl w:val="1"/>
+          <w:numId w:val="10"/>
+        </w:numPr>
+      </w:pPr>
+      <w:r>
+        <w:t>C-02 - Contrôler le PDF après export</w:t>
+      </w:r>
+    </w:p>
+    <w:p>
+      <w:r>
+        <w:t>Problème : Cette étape de finalisation ne peut pas être prouvée par le DOCX seul.</w:t>
+      </w:r>
+    </w:p>
+    <w:p>
+      <w:r>
+        <w:t>Pourquoi : Les pertes introduites à l'export sont détectées avant diffusion.</w:t>
+      </w:r>
+    </w:p>
+    <w:p>
+      <w:r>
+        <w:t>Règle : Contrôler avec PAC, ou Acrobat Pro en alternative, le titre, la langue, les balises et l'ordre de lecture, puis terminer par la checklist humaine.</w:t>
+      </w:r>
+    </w:p>
+    <w:p>
+      <w:r>
+        <w:t>Dans Word : Ouvrir le PDF exporté dans PAC ; utiliser Acrobat Pro comme alternative si PAC n'est pas disponible.</w:t>
+      </w:r>
+    </w:p>
+    <w:p>
+      <w:r>
+        <w:t>Dans LibreOffice Writer : Ouvrir le PDF exporté dans PAC ; utiliser Acrobat Pro comme alternative si PAC n'est pas disponible.</w:t>
+      </w:r>
+    </w:p>
+    <w:p>
+      <w:r>
+        <w:t>À faire : Exécuter le contrôle du PDF, traiter les alertes pertinentes et consigner le résultat humain.</w:t>
+      </w:r>
+    </w:p>
+    <w:p>
+      <w:r>
+        <w:t>Preuve : Rapport PAC ou Acrobat conservé</w:t>
+      </w:r>
+    </w:p>
     <w:sectPr>
       <w:type w:val="continuous"/>
       <w:pgSz w:w="12240" w:h="15840"/>
@@ -1824,7 +2078,7 @@
         <w:color w:val="000000"/>
         <w:sz w:val="24"/>
       </w:rPr>
-      <w:t>Rapport trimestriel - Bilan T1 2025</w:t>
+      <w:t>Rendre un document Word accessible</w:t>
     </w:r>
     <w:r>
       <w:rPr>
@@ -1947,7 +2201,7 @@
         <w:color w:val="000000"/>
         <w:sz w:val="24"/>
       </w:rPr>
-      <w:t>Direction des affaires juridiques - Rapport trimestriel T1 2025</w:t>
+      <w:t>Guide pratique - Rendre un document Word accessible</w:t>
     </w:r>
   </w:p>
 </w:hdr>

</xml_diff>

<commit_message>
TP Word : affiche en P-06, statut P-11 en en-tête
P-06 utilisait une icône d'enveloppe peu parlante. L'affiche des
20 ans de la loi handicap la remplace : son message fait partie de
l'image, l'alternative du corrigé le restitue. L'enveloppe reste
le pictogramme décoratif de P-08.

P-11 décrivait un filigrane retiré le 2 octobre pour lisibilité.
Le statut « Document confidentiel » est désormais porté par
l'en-tête des trois versions ; la matrice remplace « filigrane »
par « en-tête », d'où la mise à jour du commentaire, de la
checklist et de trois slides (deck régénéré en Arial). PRD et
ticket T04 tracent la décision.
</commit_message>
<xml_diff>
--- a/_source/tp-doc-accessible.docx
+++ b/_source/tp-doc-accessible.docx
@@ -804,8 +804,8 @@
       <w:r>
         <w:drawing>
           <wp:inline xmlns:a="http://schemas.openxmlformats.org/drawingml/2006/main" xmlns:pic="http://schemas.openxmlformats.org/drawingml/2006/picture">
-            <wp:extent cx="457200" cy="457200"/>
-            <wp:docPr id="1" name="Picture 1" descr="Contact par courriel." title="Contact par courriel"/>
+            <wp:extent cx="2011680" cy="2399899"/>
+            <wp:docPr id="1" name="Picture 1" descr="Affiche des 20 ans de la loi handicap : Agents publics, changeons cette réalité grâce aux outils disponibles sur accessibilite.gouv.fr. Le handicap n'est pas un choix. L'accessibilité non plus." title="Affiche des 20 ans de la loi handicap"/>
             <wp:cNvGraphicFramePr>
               <a:graphicFrameLocks noChangeAspect="1"/>
             </wp:cNvGraphicFramePr>
@@ -813,7 +813,7 @@
               <a:graphicData uri="http://schemas.openxmlformats.org/drawingml/2006/picture">
                 <pic:pic>
                   <pic:nvPicPr>
-                    <pic:cNvPr id="0" name="icone-enveloppe.png"/>
+                    <pic:cNvPr id="0" name="affiche-sig-handicap.jpg"/>
                     <pic:cNvPicPr/>
                   </pic:nvPicPr>
                   <pic:blipFill>
@@ -825,7 +825,7 @@
                   <pic:spPr>
                     <a:xfrm>
                       <a:off x="0" y="0"/>
-                      <a:ext cx="457200" cy="457200"/>
+                      <a:ext cx="2011680" cy="2399899"/>
                     </a:xfrm>
                     <a:prstGeom prst="rect"/>
                   </pic:spPr>
@@ -1008,7 +1008,7 @@
                     <pic:cNvPicPr/>
                   </pic:nvPicPr>
                   <pic:blipFill>
-                    <a:blip r:embed="rId11"/>
+                    <a:blip r:embed="rId13"/>
                     <a:stretch>
                       <a:fillRect/>
                     </a:stretch>
@@ -1141,7 +1141,7 @@
       <w:r>
         <w:t xml:space="preserve">Pour accéder aux annexes, </w:t>
       </w:r>
-      <w:hyperlink r:id="rId13">
+      <w:hyperlink r:id="rId14">
         <w:r>
           <w:rPr>
             <w:color w:val="0000FF"/>
@@ -1165,17 +1165,17 @@
         </w:numPr>
       </w:pPr>
       <w:r>
-        <w:t>P-11 - Reprendre dans le corps l'information d'un filigrane</w:t>
+        <w:t>P-11 - Reprendre dans le corps l'information d'un en-tête</w:t>
       </w:r>
     </w:p>
     <w:p>
       <w:r>
-        <w:t>Problème : Le statut du document apparaît seulement dans un filigrane.</w:t>
+        <w:t>Problème : Le statut du document apparaît seulement dans l'en-tête.</w:t>
       </w:r>
     </w:p>
     <w:p>
       <w:r>
-        <w:t>Pourquoi : Une information essentielle reste disponible même si le filigrane n'est pas restitué.</w:t>
+        <w:t>Pourquoi : Une information essentielle reste disponible même si l'en-tête n'est pas restitué.</w:t>
       </w:r>
     </w:p>
     <w:p>
@@ -1185,12 +1185,12 @@
     </w:p>
     <w:p>
       <w:r>
-        <w:t>Dans Word : Ajouter le statut dans le corps avec un style adapté ; conserver ou retirer le filigrane selon son utilité visuelle.</w:t>
+        <w:t>Dans Word : Ajouter le statut dans le corps avec un style adapté ; l'en-tête peut le conserver, sans en être l'unique porteur.</w:t>
       </w:r>
     </w:p>
     <w:p>
       <w:r>
-        <w:t>Dans LibreOffice Writer : Ajouter le statut dans le corps avec un style adapté ; traiter l'arrière-plan séparément.</w:t>
+        <w:t>Dans LibreOffice Writer : Ajouter le statut dans le corps avec un style adapté ; l'en-tête peut le conserver, sans en être l'unique porteur.</w:t>
       </w:r>
     </w:p>
     <w:p>
@@ -1361,7 +1361,7 @@
                     <pic:cNvPicPr/>
                   </pic:nvPicPr>
                   <pic:blipFill>
-                    <a:blip r:embed="rId14"/>
+                    <a:blip r:embed="rId15"/>
                     <a:stretch>
                       <a:fillRect/>
                     </a:stretch>
@@ -2204,6 +2204,19 @@
       <w:t>Guide pratique - Rendre un document Word accessible</w:t>
     </w:r>
   </w:p>
+  <w:p>
+    <w:pPr>
+      <w:jc w:val="right"/>
+    </w:pPr>
+    <w:r>
+      <w:rPr>
+        <w:rFonts w:ascii="Arial" w:hAnsi="Arial"/>
+        <w:color w:val="000000"/>
+        <w:sz w:val="24"/>
+      </w:rPr>
+      <w:t>Document confidentiel</w:t>
+    </w:r>
+  </w:p>
 </w:hdr>
 </file>
 

</xml_diff>

<commit_message>
TP Word : gras, interligne et pagination
Lisibilité des supports du TP Word, à la demande d'Alex.

- Commentaires de correction : identifiant et intitulés des
  rubriques en gras, interligne double (texte inchangé).
- Trois DOCX : intitulé de chaque rubrique des contrôles en gras
  (Problème, Pourquoi, Règle, Dans Word, Dans LibreOffice Writer,
  À faire, Preuve). Le contenu de l'exercice et ses défauts
  volontaires ne changent pas.
- Checklist DOCX : pied de page « Page X sur Y » en champs Word.

Les tests lisent désormais le texte des commentaires plutôt que
leur XML brut, découpé en plusieurs runs par la mise en gras.
</commit_message>
<xml_diff>
--- a/_source/tp-doc-accessible.docx
+++ b/_source/tp-doc-accessible.docx
@@ -39,37 +39,79 @@
     </w:p>
     <w:p>
       <w:r>
-        <w:t>Problème : Le titre principal et des intertitres sont seulement mis en forme visuellement.</w:t>
+        <w:rPr>
+          <w:b/>
+        </w:rPr>
+        <w:t>Problème :</w:t>
+      </w:r>
+      <w:r>
+        <w:t xml:space="preserve"> Le titre principal et des intertitres sont seulement mis en forme visuellement.</w:t>
       </w:r>
     </w:p>
     <w:p>
       <w:r>
-        <w:t>Pourquoi : Les technologies d'assistance identifient le document et sa structure.</w:t>
+        <w:rPr>
+          <w:b/>
+        </w:rPr>
+        <w:t>Pourquoi :</w:t>
+      </w:r>
+      <w:r>
+        <w:t xml:space="preserve"> Les technologies d'assistance identifient le document et sa structure.</w:t>
       </w:r>
     </w:p>
     <w:p>
       <w:r>
-        <w:t>Règle : Utiliser le style Titre pour le titre principal et les styles Titre 1, Titre 2 et suivants pour la hiérarchie.</w:t>
+        <w:rPr>
+          <w:b/>
+        </w:rPr>
+        <w:t>Règle :</w:t>
+      </w:r>
+      <w:r>
+        <w:t xml:space="preserve"> Utiliser le style Titre pour le titre principal et les styles Titre 1, Titre 2 et suivants pour la hiérarchie.</w:t>
       </w:r>
     </w:p>
     <w:p>
       <w:r>
-        <w:t>Dans Word : Accueil &gt; Styles, puis appliquer Titre au titre principal et les niveaux de titre aux sections.</w:t>
+        <w:rPr>
+          <w:b/>
+        </w:rPr>
+        <w:t>Dans Word :</w:t>
+      </w:r>
+      <w:r>
+        <w:t xml:space="preserve"> Accueil &gt; Styles, puis appliquer Titre au titre principal et les niveaux de titre aux sections.</w:t>
       </w:r>
     </w:p>
     <w:p>
       <w:r>
-        <w:t>Dans LibreOffice Writer : Styles &gt; Gérer les styles, puis appliquer Titre et Titre 1 à Titre 3 selon le niveau.</w:t>
+        <w:rPr>
+          <w:b/>
+        </w:rPr>
+        <w:t>Dans LibreOffice Writer :</w:t>
+      </w:r>
+      <w:r>
+        <w:t xml:space="preserve"> Styles &gt; Gérer les styles, puis appliquer Titre et Titre 1 à Titre 3 selon le niveau.</w:t>
       </w:r>
     </w:p>
     <w:p>
       <w:r>
-        <w:t>À faire : Appliquer les styles adaptés sans changer le texte.</w:t>
+        <w:rPr>
+          <w:b/>
+        </w:rPr>
+        <w:t>À faire :</w:t>
+      </w:r>
+      <w:r>
+        <w:t xml:space="preserve"> Appliquer les styles adaptés sans changer le texte.</w:t>
       </w:r>
     </w:p>
     <w:p>
       <w:r>
-        <w:t>Preuve : Styles vérifiables dans le DOCX et structure lisible dans le volet de navigation.</w:t>
+        <w:rPr>
+          <w:b/>
+        </w:rPr>
+        <w:t>Preuve :</w:t>
+      </w:r>
+      <w:r>
+        <w:t xml:space="preserve"> Styles vérifiables dans le DOCX et structure lisible dans le volet de navigation.</w:t>
       </w:r>
     </w:p>
     <w:p>
@@ -88,37 +130,79 @@
     </w:p>
     <w:p>
       <w:r>
-        <w:t>Problème : La hiérarchie saute un niveau et la numérotation visuelle contredit la structure.</w:t>
+        <w:rPr>
+          <w:b/>
+        </w:rPr>
+        <w:t>Problème :</w:t>
+      </w:r>
+      <w:r>
+        <w:t xml:space="preserve"> La hiérarchie saute un niveau et la numérotation visuelle contredit la structure.</w:t>
       </w:r>
     </w:p>
     <w:p>
       <w:r>
-        <w:t>Pourquoi : Une structure sans saut rend le plan compréhensible et navigable.</w:t>
+        <w:rPr>
+          <w:b/>
+        </w:rPr>
+        <w:t>Pourquoi :</w:t>
+      </w:r>
+      <w:r>
+        <w:t xml:space="preserve"> Une structure sans saut rend le plan compréhensible et navigable.</w:t>
       </w:r>
     </w:p>
     <w:p>
       <w:r>
-        <w:t>Règle : Enchaîner les niveaux de titres sans saut et conserver une numérotation cohérente.</w:t>
+        <w:rPr>
+          <w:b/>
+        </w:rPr>
+        <w:t>Règle :</w:t>
+      </w:r>
+      <w:r>
+        <w:t xml:space="preserve"> Enchaîner les niveaux de titres sans saut et conserver une numérotation cohérente.</w:t>
       </w:r>
     </w:p>
     <w:p>
       <w:r>
-        <w:t>Dans Word : Affichage &gt; Volet de navigation, puis corriger les styles depuis Accueil &gt; Styles.</w:t>
+        <w:rPr>
+          <w:b/>
+        </w:rPr>
+        <w:t>Dans Word :</w:t>
+      </w:r>
+      <w:r>
+        <w:t xml:space="preserve"> Affichage &gt; Volet de navigation, puis corriger les styles depuis Accueil &gt; Styles.</w:t>
       </w:r>
     </w:p>
     <w:p>
       <w:r>
-        <w:t>Dans LibreOffice Writer : Affichage &gt; Navigateur, puis corriger les styles depuis Styles &gt; Gérer les styles.</w:t>
+        <w:rPr>
+          <w:b/>
+        </w:rPr>
+        <w:t>Dans LibreOffice Writer :</w:t>
+      </w:r>
+      <w:r>
+        <w:t xml:space="preserve"> Affichage &gt; Navigateur, puis corriger les styles depuis Styles &gt; Gérer les styles.</w:t>
       </w:r>
     </w:p>
     <w:p>
       <w:r>
-        <w:t>À faire : Réordonner les niveaux de styles et leur numérotation.</w:t>
+        <w:rPr>
+          <w:b/>
+        </w:rPr>
+        <w:t>À faire :</w:t>
+      </w:r>
+      <w:r>
+        <w:t xml:space="preserve"> Réordonner les niveaux de styles et leur numérotation.</w:t>
       </w:r>
     </w:p>
     <w:p>
       <w:r>
-        <w:t>Preuve : Ordre des niveaux contrôlé dans le XML et confirmé dans le volet de navigation.</w:t>
+        <w:rPr>
+          <w:b/>
+        </w:rPr>
+        <w:t>Preuve :</w:t>
+      </w:r>
+      <w:r>
+        <w:t xml:space="preserve"> Ordre des niveaux contrôlé dans le XML et confirmé dans le volet de navigation.</w:t>
       </w:r>
     </w:p>
     <w:p>
@@ -179,37 +263,79 @@
     </w:p>
     <w:p>
       <w:r>
-        <w:t>Problème : Le document ne propose pas de sommaire automatique actualisable.</w:t>
+        <w:rPr>
+          <w:b/>
+        </w:rPr>
+        <w:t>Problème :</w:t>
+      </w:r>
+      <w:r>
+        <w:t xml:space="preserve"> Le document ne propose pas de sommaire automatique actualisable.</w:t>
       </w:r>
     </w:p>
     <w:p>
       <w:r>
-        <w:t>Pourquoi : Le volet et le sommaire donnent deux accès fiables à la structure.</w:t>
+        <w:rPr>
+          <w:b/>
+        </w:rPr>
+        <w:t>Pourquoi :</w:t>
+      </w:r>
+      <w:r>
+        <w:t xml:space="preserve"> Le volet et le sommaire donnent deux accès fiables à la structure.</w:t>
       </w:r>
     </w:p>
     <w:p>
       <w:r>
-        <w:t>Règle : Vérifier le plan dans le volet de navigation et insérer un sommaire fondé sur les styles de titres.</w:t>
+        <w:rPr>
+          <w:b/>
+        </w:rPr>
+        <w:t>Règle :</w:t>
+      </w:r>
+      <w:r>
+        <w:t xml:space="preserve"> Vérifier le plan dans le volet de navigation et insérer un sommaire fondé sur les styles de titres.</w:t>
       </w:r>
     </w:p>
     <w:p>
       <w:r>
-        <w:t>Dans Word : Références &gt; Table des matières &gt; Table automatique, puis clic droit &gt; Mettre à jour les champs.</w:t>
+        <w:rPr>
+          <w:b/>
+        </w:rPr>
+        <w:t>Dans Word :</w:t>
+      </w:r>
+      <w:r>
+        <w:t xml:space="preserve"> Références &gt; Table des matières &gt; Table automatique, puis clic droit &gt; Mettre à jour les champs.</w:t>
       </w:r>
     </w:p>
     <w:p>
       <w:r>
-        <w:t>Dans LibreOffice Writer : Insertion &gt; Table des matières et index &gt; Table des matières, index ou bibliographie.</w:t>
+        <w:rPr>
+          <w:b/>
+        </w:rPr>
+        <w:t>Dans LibreOffice Writer :</w:t>
+      </w:r>
+      <w:r>
+        <w:t xml:space="preserve"> Insertion &gt; Table des matières et index &gt; Table des matières, index ou bibliographie.</w:t>
       </w:r>
     </w:p>
     <w:p>
       <w:r>
-        <w:t>À faire : Contrôler le volet, insérer le sommaire et vérifier sa mise à jour.</w:t>
+        <w:rPr>
+          <w:b/>
+        </w:rPr>
+        <w:t>À faire :</w:t>
+      </w:r>
+      <w:r>
+        <w:t xml:space="preserve"> Contrôler le volet, insérer le sommaire et vérifier sa mise à jour.</w:t>
       </w:r>
     </w:p>
     <w:p>
       <w:r>
-        <w:t>Preuve : Navigation cohérente et sommaire actualisable après modification d'un titre.</w:t>
+        <w:rPr>
+          <w:b/>
+        </w:rPr>
+        <w:t>Preuve :</w:t>
+      </w:r>
+      <w:r>
+        <w:t xml:space="preserve"> Navigation cohérente et sommaire actualisable après modification d'un titre.</w:t>
       </w:r>
     </w:p>
     <w:p>
@@ -515,37 +641,79 @@
     </w:p>
     <w:p>
       <w:r>
-        <w:t>Problème : Une liste est simulée avec des caractères saisis au début des paragraphes.</w:t>
+        <w:rPr>
+          <w:b/>
+        </w:rPr>
+        <w:t>Problème :</w:t>
+      </w:r>
+      <w:r>
+        <w:t xml:space="preserve"> Une liste est simulée avec des caractères saisis au début des paragraphes.</w:t>
       </w:r>
     </w:p>
     <w:p>
       <w:r>
-        <w:t>Pourquoi : Les lecteurs d'écran annoncent la nature et la longueur des listes.</w:t>
+        <w:rPr>
+          <w:b/>
+        </w:rPr>
+        <w:t>Pourquoi :</w:t>
+      </w:r>
+      <w:r>
+        <w:t xml:space="preserve"> Les lecteurs d'écran annoncent la nature et la longueur des listes.</w:t>
       </w:r>
     </w:p>
     <w:p>
       <w:r>
-        <w:t>Règle : Créer les puces et numéros avec les fonctions de liste du traitement de texte.</w:t>
+        <w:rPr>
+          <w:b/>
+        </w:rPr>
+        <w:t>Règle :</w:t>
+      </w:r>
+      <w:r>
+        <w:t xml:space="preserve"> Créer les puces et numéros avec les fonctions de liste du traitement de texte.</w:t>
       </w:r>
     </w:p>
     <w:p>
       <w:r>
-        <w:t>Dans Word : Sélectionner les paragraphes, puis Accueil &gt; Puces ou Numérotation.</w:t>
+        <w:rPr>
+          <w:b/>
+        </w:rPr>
+        <w:t>Dans Word :</w:t>
+      </w:r>
+      <w:r>
+        <w:t xml:space="preserve"> Sélectionner les paragraphes, puis Accueil &gt; Puces ou Numérotation.</w:t>
       </w:r>
     </w:p>
     <w:p>
       <w:r>
-        <w:t>Dans LibreOffice Writer : Sélectionner les paragraphes, puis Format &gt; Puces et numérotation.</w:t>
+        <w:rPr>
+          <w:b/>
+        </w:rPr>
+        <w:t>Dans LibreOffice Writer :</w:t>
+      </w:r>
+      <w:r>
+        <w:t xml:space="preserve"> Sélectionner les paragraphes, puis Format &gt; Puces et numérotation.</w:t>
       </w:r>
     </w:p>
     <w:p>
       <w:r>
-        <w:t>À faire : Remplacer la fausse liste par une liste native.</w:t>
+        <w:rPr>
+          <w:b/>
+        </w:rPr>
+        <w:t>À faire :</w:t>
+      </w:r>
+      <w:r>
+        <w:t xml:space="preserve"> Remplacer la fausse liste par une liste native.</w:t>
       </w:r>
     </w:p>
     <w:p>
       <w:r>
-        <w:t>Preuve : Structure de liste présente dans le DOCX et annoncée comme liste.</w:t>
+        <w:rPr>
+          <w:b/>
+        </w:rPr>
+        <w:t>Preuve :</w:t>
+      </w:r>
+      <w:r>
+        <w:t xml:space="preserve"> Structure de liste présente dans le DOCX et annoncée comme liste.</w:t>
       </w:r>
     </w:p>
     <w:p>
@@ -622,37 +790,79 @@
     </w:p>
     <w:p>
       <w:r>
-        <w:t>Problème : Une zone cumule paragraphes vides, espaces successifs, tabulations, retours forcés et saut inadapté.</w:t>
+        <w:rPr>
+          <w:b/>
+        </w:rPr>
+        <w:t>Problème :</w:t>
+      </w:r>
+      <w:r>
+        <w:t xml:space="preserve"> Une zone cumule paragraphes vides, espaces successifs, tabulations, retours forcés et saut inadapté.</w:t>
       </w:r>
     </w:p>
     <w:p>
       <w:r>
-        <w:t>Pourquoi : Une mise en page robuste reste compréhensible quand l'affichage ou la restitution change.</w:t>
+        <w:rPr>
+          <w:b/>
+        </w:rPr>
+        <w:t>Pourquoi :</w:t>
+      </w:r>
+      <w:r>
+        <w:t xml:space="preserve"> Une mise en page robuste reste compréhensible quand l'affichage ou la restitution change.</w:t>
       </w:r>
     </w:p>
     <w:p>
       <w:r>
-        <w:t>Règle : Utiliser espacements, retraits, sauts et colonnes plutôt que paragraphes vides, espaces, tabulations ou retours forcés.</w:t>
+        <w:rPr>
+          <w:b/>
+        </w:rPr>
+        <w:t>Règle :</w:t>
+      </w:r>
+      <w:r>
+        <w:t xml:space="preserve"> Utiliser espacements, retraits, sauts et colonnes plutôt que paragraphes vides, espaces, tabulations ou retours forcés.</w:t>
       </w:r>
     </w:p>
     <w:p>
       <w:r>
-        <w:t>Dans Word : Accueil &gt; Afficher tout, puis régler Paragraphe, Mise en page &gt; Sauts et Mise en page &gt; Colonnes.</w:t>
+        <w:rPr>
+          <w:b/>
+        </w:rPr>
+        <w:t>Dans Word :</w:t>
+      </w:r>
+      <w:r>
+        <w:t xml:space="preserve"> Accueil &gt; Afficher tout, puis régler Paragraphe, Mise en page &gt; Sauts et Mise en page &gt; Colonnes.</w:t>
       </w:r>
     </w:p>
     <w:p>
       <w:r>
-        <w:t>Dans LibreOffice Writer : Affichage &gt; Marques de formatage, puis Format &gt; Paragraphe et Format &gt; Style de page.</w:t>
+        <w:rPr>
+          <w:b/>
+        </w:rPr>
+        <w:t>Dans LibreOffice Writer :</w:t>
+      </w:r>
+      <w:r>
+        <w:t xml:space="preserve"> Affichage &gt; Marques de formatage, puis Format &gt; Paragraphe et Format &gt; Style de page.</w:t>
       </w:r>
     </w:p>
     <w:p>
       <w:r>
-        <w:t>À faire : Afficher les marques puis remplacer chaque artifice par la fonction prévue.</w:t>
+        <w:rPr>
+          <w:b/>
+        </w:rPr>
+        <w:t>À faire :</w:t>
+      </w:r>
+      <w:r>
+        <w:t xml:space="preserve"> Afficher les marques puis remplacer chaque artifice par la fonction prévue.</w:t>
       </w:r>
     </w:p>
     <w:p>
       <w:r>
-        <w:t>Preuve : Absence des artifices ciblés dans le XML et contrôle visuel avec marques affichées.</w:t>
+        <w:rPr>
+          <w:b/>
+        </w:rPr>
+        <w:t>Preuve :</w:t>
+      </w:r>
+      <w:r>
+        <w:t xml:space="preserve"> Absence des artifices ciblés dans le XML et contrôle visuel avec marques affichées.</w:t>
       </w:r>
     </w:p>
     <w:p>
@@ -764,37 +974,79 @@
     </w:p>
     <w:p>
       <w:r>
-        <w:t>Problème : Une image informative possède une alternative absente ou inadéquate.</w:t>
+        <w:rPr>
+          <w:b/>
+        </w:rPr>
+        <w:t>Problème :</w:t>
+      </w:r>
+      <w:r>
+        <w:t xml:space="preserve"> Une image informative possède une alternative absente ou inadéquate.</w:t>
       </w:r>
     </w:p>
     <w:p>
       <w:r>
-        <w:t>Pourquoi : Une personne qui ne voit pas l'image reçoit son information utile.</w:t>
+        <w:rPr>
+          <w:b/>
+        </w:rPr>
+        <w:t>Pourquoi :</w:t>
+      </w:r>
+      <w:r>
+        <w:t xml:space="preserve"> Une personne qui ne voit pas l'image reçoit son information utile.</w:t>
       </w:r>
     </w:p>
     <w:p>
       <w:r>
-        <w:t>Règle : Rédiger une alternative concise liée au contexte, sans reprendre automatiquement une description générée.</w:t>
+        <w:rPr>
+          <w:b/>
+        </w:rPr>
+        <w:t>Règle :</w:t>
+      </w:r>
+      <w:r>
+        <w:t xml:space="preserve"> Rédiger une alternative concise liée au contexte, sans reprendre automatiquement une description générée.</w:t>
       </w:r>
     </w:p>
     <w:p>
       <w:r>
-        <w:t>Dans Word : Clic droit sur l'image &gt; Afficher le texte de remplacement, puis renseigner la description.</w:t>
+        <w:rPr>
+          <w:b/>
+        </w:rPr>
+        <w:t>Dans Word :</w:t>
+      </w:r>
+      <w:r>
+        <w:t xml:space="preserve"> Clic droit sur l'image &gt; Afficher le texte de remplacement, puis renseigner la description.</w:t>
       </w:r>
     </w:p>
     <w:p>
       <w:r>
-        <w:t>Dans LibreOffice Writer : Clic droit sur l'image &gt; Propriétés &gt; Options, puis renseigner le texte alternatif.</w:t>
+        <w:rPr>
+          <w:b/>
+        </w:rPr>
+        <w:t>Dans LibreOffice Writer :</w:t>
+      </w:r>
+      <w:r>
+        <w:t xml:space="preserve"> Clic droit sur l'image &gt; Propriétés &gt; Options, puis renseigner le texte alternatif.</w:t>
       </w:r>
     </w:p>
     <w:p>
       <w:r>
-        <w:t>À faire : Observer le rôle de l'image et rédiger soi-même son alternative.</w:t>
+        <w:rPr>
+          <w:b/>
+        </w:rPr>
+        <w:t>À faire :</w:t>
+      </w:r>
+      <w:r>
+        <w:t xml:space="preserve"> Observer le rôle de l'image et rédiger soi-même son alternative.</w:t>
       </w:r>
     </w:p>
     <w:p>
       <w:r>
-        <w:t>Preuve : Alternative présente dans le DOCX et jugée pertinente par lecture humaine.</w:t>
+        <w:rPr>
+          <w:b/>
+        </w:rPr>
+        <w:t>Preuve :</w:t>
+      </w:r>
+      <w:r>
+        <w:t xml:space="preserve"> Alternative présente dans le DOCX et jugée pertinente par lecture humaine.</w:t>
       </w:r>
     </w:p>
     <w:p>
@@ -852,37 +1104,79 @@
     </w:p>
     <w:p>
       <w:r>
-        <w:t>Problème : Une image complexe n'offre ni résumé utile ni description détaillée équivalente.</w:t>
+        <w:rPr>
+          <w:b/>
+        </w:rPr>
+        <w:t>Problème :</w:t>
+      </w:r>
+      <w:r>
+        <w:t xml:space="preserve"> Une image complexe n'offre ni résumé utile ni description détaillée équivalente.</w:t>
       </w:r>
     </w:p>
     <w:p>
       <w:r>
-        <w:t>Pourquoi : Les données ou relations complexes restent disponibles sous forme textuelle.</w:t>
+        <w:rPr>
+          <w:b/>
+        </w:rPr>
+        <w:t>Pourquoi :</w:t>
+      </w:r>
+      <w:r>
+        <w:t xml:space="preserve"> Les données ou relations complexes restent disponibles sous forme textuelle.</w:t>
       </w:r>
     </w:p>
     <w:p>
       <w:r>
-        <w:t>Règle : Associer une alternative courte à une description détaillée adjacente dans le corps.</w:t>
+        <w:rPr>
+          <w:b/>
+        </w:rPr>
+        <w:t>Règle :</w:t>
+      </w:r>
+      <w:r>
+        <w:t xml:space="preserve"> Associer une alternative courte à une description détaillée adjacente dans le corps.</w:t>
       </w:r>
     </w:p>
     <w:p>
       <w:r>
-        <w:t>Dans Word : Ajouter le texte de remplacement, puis saisir la description détaillée dans un paragraphe voisin.</w:t>
+        <w:rPr>
+          <w:b/>
+        </w:rPr>
+        <w:t>Dans Word :</w:t>
+      </w:r>
+      <w:r>
+        <w:t xml:space="preserve"> Ajouter le texte de remplacement, puis saisir la description détaillée dans un paragraphe voisin.</w:t>
       </w:r>
     </w:p>
     <w:p>
       <w:r>
-        <w:t>Dans LibreOffice Writer : Renseigner le texte alternatif dans les propriétés, puis ajouter la description dans le corps.</w:t>
+        <w:rPr>
+          <w:b/>
+        </w:rPr>
+        <w:t>Dans LibreOffice Writer :</w:t>
+      </w:r>
+      <w:r>
+        <w:t xml:space="preserve"> Renseigner le texte alternatif dans les propriétés, puis ajouter la description dans le corps.</w:t>
       </w:r>
     </w:p>
     <w:p>
       <w:r>
-        <w:t>À faire : Ajouter une alternative courte et une description structurée à proximité.</w:t>
+        <w:rPr>
+          <w:b/>
+        </w:rPr>
+        <w:t>À faire :</w:t>
+      </w:r>
+      <w:r>
+        <w:t xml:space="preserve"> Ajouter une alternative courte et une description structurée à proximité.</w:t>
       </w:r>
     </w:p>
     <w:p>
       <w:r>
-        <w:t>Preuve : Équivalence d'information vérifiée sans consulter l'image.</w:t>
+        <w:rPr>
+          <w:b/>
+        </w:rPr>
+        <w:t>Preuve :</w:t>
+      </w:r>
+      <w:r>
+        <w:t xml:space="preserve"> Équivalence d'information vérifiée sans consulter l'image.</w:t>
       </w:r>
     </w:p>
     <w:p>
@@ -949,37 +1243,79 @@
     </w:p>
     <w:p>
       <w:r>
-        <w:t>Problème : Une image purement redondante est annoncée comme si elle apportait une information.</w:t>
+        <w:rPr>
+          <w:b/>
+        </w:rPr>
+        <w:t>Problème :</w:t>
+      </w:r>
+      <w:r>
+        <w:t xml:space="preserve"> Une image purement redondante est annoncée comme si elle apportait une information.</w:t>
       </w:r>
     </w:p>
     <w:p>
       <w:r>
-        <w:t>Pourquoi : Les images sans information n'alourdissent pas la restitution.</w:t>
+        <w:rPr>
+          <w:b/>
+        </w:rPr>
+        <w:t>Pourquoi :</w:t>
+      </w:r>
+      <w:r>
+        <w:t xml:space="preserve"> Les images sans information n'alourdissent pas la restitution.</w:t>
       </w:r>
     </w:p>
     <w:p>
       <w:r>
-        <w:t>Règle : Déclarer décorative uniquement une image dont l'information est déjà entièrement donnée par le texte voisin.</w:t>
+        <w:rPr>
+          <w:b/>
+        </w:rPr>
+        <w:t>Règle :</w:t>
+      </w:r>
+      <w:r>
+        <w:t xml:space="preserve"> Déclarer décorative uniquement une image dont l'information est déjà entièrement donnée par le texte voisin.</w:t>
       </w:r>
     </w:p>
     <w:p>
       <w:r>
-        <w:t>Dans Word : Afficher le texte de remplacement puis cocher Marquer comme décoratif.</w:t>
+        <w:rPr>
+          <w:b/>
+        </w:rPr>
+        <w:t>Dans Word :</w:t>
+      </w:r>
+      <w:r>
+        <w:t xml:space="preserve"> Afficher le texte de remplacement puis cocher Marquer comme décoratif.</w:t>
       </w:r>
     </w:p>
     <w:p>
       <w:r>
-        <w:t>Dans LibreOffice Writer : Si l'option Décoratif existe, l'activer ; sinon laisser titre et description vides seulement après vérification de la redondance.</w:t>
+        <w:rPr>
+          <w:b/>
+        </w:rPr>
+        <w:t>Dans LibreOffice Writer :</w:t>
+      </w:r>
+      <w:r>
+        <w:t xml:space="preserve"> Si l'option Décoratif existe, l'activer ; sinon laisser titre et description vides seulement après vérification de la redondance.</w:t>
       </w:r>
     </w:p>
     <w:p>
       <w:r>
-        <w:t>À faire : Vérifier la redondance puis appliquer le traitement décoratif adapté au logiciel.</w:t>
+        <w:rPr>
+          <w:b/>
+        </w:rPr>
+        <w:t>À faire :</w:t>
+      </w:r>
+      <w:r>
+        <w:t xml:space="preserve"> Vérifier la redondance puis appliquer le traitement décoratif adapté au logiciel.</w:t>
       </w:r>
     </w:p>
     <w:p>
       <w:r>
-        <w:t>Preuve : Marqueur décoratif ou équivalent vérifié et absence de perte d'information confirmée.</w:t>
+        <w:rPr>
+          <w:b/>
+        </w:rPr>
+        <w:t>Preuve :</w:t>
+      </w:r>
+      <w:r>
+        <w:t xml:space="preserve"> Marqueur décoratif ou équivalent vérifié et absence de perte d'information confirmée.</w:t>
       </w:r>
     </w:p>
     <w:p>
@@ -1046,37 +1382,79 @@
     </w:p>
     <w:p>
       <w:r>
-        <w:t>Problème : Une consigne utile est uniquement présente dans une image de texte.</w:t>
+        <w:rPr>
+          <w:b/>
+        </w:rPr>
+        <w:t>Problème :</w:t>
+      </w:r>
+      <w:r>
+        <w:t xml:space="preserve"> Une consigne utile est uniquement présente dans une image de texte.</w:t>
       </w:r>
     </w:p>
     <w:p>
       <w:r>
-        <w:t>Pourquoi : Le contenu peut être sélectionné, agrandi, recherché et restitué correctement.</w:t>
+        <w:rPr>
+          <w:b/>
+        </w:rPr>
+        <w:t>Pourquoi :</w:t>
+      </w:r>
+      <w:r>
+        <w:t xml:space="preserve"> Le contenu peut être sélectionné, agrandi, recherché et restitué correctement.</w:t>
       </w:r>
     </w:p>
     <w:p>
       <w:r>
-        <w:t>Règle : Saisir en texte réel toute information textuelle qui n'a pas besoin d'être une image.</w:t>
+        <w:rPr>
+          <w:b/>
+        </w:rPr>
+        <w:t>Règle :</w:t>
+      </w:r>
+      <w:r>
+        <w:t xml:space="preserve"> Saisir en texte réel toute information textuelle qui n'a pas besoin d'être une image.</w:t>
       </w:r>
     </w:p>
     <w:p>
       <w:r>
-        <w:t>Dans Word : Insérer le texte dans un paragraphe structuré, appliquer les styles utiles puis supprimer l'image de texte.</w:t>
+        <w:rPr>
+          <w:b/>
+        </w:rPr>
+        <w:t>Dans Word :</w:t>
+      </w:r>
+      <w:r>
+        <w:t xml:space="preserve"> Insérer le texte dans un paragraphe structuré, appliquer les styles utiles puis supprimer l'image de texte.</w:t>
       </w:r>
     </w:p>
     <w:p>
       <w:r>
-        <w:t>Dans LibreOffice Writer : Saisir le texte dans le corps, appliquer les styles utiles puis supprimer l'image de texte.</w:t>
+        <w:rPr>
+          <w:b/>
+        </w:rPr>
+        <w:t>Dans LibreOffice Writer :</w:t>
+      </w:r>
+      <w:r>
+        <w:t xml:space="preserve"> Saisir le texte dans le corps, appliquer les styles utiles puis supprimer l'image de texte.</w:t>
       </w:r>
     </w:p>
     <w:p>
       <w:r>
-        <w:t>À faire : Reproduire fidèlement le texte dans le corps puis retirer l'image devenue inutile.</w:t>
+        <w:rPr>
+          <w:b/>
+        </w:rPr>
+        <w:t>À faire :</w:t>
+      </w:r>
+      <w:r>
+        <w:t xml:space="preserve"> Reproduire fidèlement le texte dans le corps puis retirer l'image devenue inutile.</w:t>
       </w:r>
     </w:p>
     <w:p>
       <w:r>
-        <w:t>Preuve : Texte sélectionnable présent dans le DOCX et image de texte absente.</w:t>
+        <w:rPr>
+          <w:b/>
+        </w:rPr>
+        <w:t>Preuve :</w:t>
+      </w:r>
+      <w:r>
+        <w:t xml:space="preserve"> Texte sélectionnable présent dans le DOCX et image de texte absente.</w:t>
       </w:r>
     </w:p>
     <w:p>
@@ -1104,37 +1482,79 @@
     </w:p>
     <w:p>
       <w:r>
-        <w:t>Problème : Un lien générique ne décrit pas sa destination et un téléchargement manque d'informations utiles.</w:t>
+        <w:rPr>
+          <w:b/>
+        </w:rPr>
+        <w:t>Problème :</w:t>
+      </w:r>
+      <w:r>
+        <w:t xml:space="preserve"> Un lien générique ne décrit pas sa destination et un téléchargement manque d'informations utiles.</w:t>
       </w:r>
     </w:p>
     <w:p>
       <w:r>
-        <w:t>Pourquoi : La destination reste compréhensible hors contexte et repérable visuellement.</w:t>
+        <w:rPr>
+          <w:b/>
+        </w:rPr>
+        <w:t>Pourquoi :</w:t>
+      </w:r>
+      <w:r>
+        <w:t xml:space="preserve"> La destination reste compréhensible hors contexte et repérable visuellement.</w:t>
       </w:r>
     </w:p>
     <w:p>
       <w:r>
-        <w:t>Règle : Employer un libellé explicite et ajouter format, poids et langue d'un téléchargement lorsque ces informations sont connues.</w:t>
+        <w:rPr>
+          <w:b/>
+        </w:rPr>
+        <w:t>Règle :</w:t>
+      </w:r>
+      <w:r>
+        <w:t xml:space="preserve"> Employer un libellé explicite et ajouter format, poids et langue d'un téléchargement lorsque ces informations sont connues.</w:t>
       </w:r>
     </w:p>
     <w:p>
       <w:r>
-        <w:t>Dans Word : Modifier le texte affiché du lien via clic droit &gt; Modifier le lien, puis compléter le libellé dans le corps.</w:t>
+        <w:rPr>
+          <w:b/>
+        </w:rPr>
+        <w:t>Dans Word :</w:t>
+      </w:r>
+      <w:r>
+        <w:t xml:space="preserve"> Modifier le texte affiché du lien via clic droit &gt; Modifier le lien, puis compléter le libellé dans le corps.</w:t>
       </w:r>
     </w:p>
     <w:p>
       <w:r>
-        <w:t>Dans LibreOffice Writer : Clic droit &gt; Modifier l'hyperlien, puis compléter le libellé dans le corps.</w:t>
+        <w:rPr>
+          <w:b/>
+        </w:rPr>
+        <w:t>Dans LibreOffice Writer :</w:t>
+      </w:r>
+      <w:r>
+        <w:t xml:space="preserve"> Clic droit &gt; Modifier l'hyperlien, puis compléter le libellé dans le corps.</w:t>
       </w:r>
     </w:p>
     <w:p>
       <w:r>
-        <w:t>À faire : Réécrire le libellé sans changer la destination puis compléter les informations disponibles.</w:t>
+        <w:rPr>
+          <w:b/>
+        </w:rPr>
+        <w:t>À faire :</w:t>
+      </w:r>
+      <w:r>
+        <w:t xml:space="preserve"> Réécrire le libellé sans changer la destination puis compléter les informations disponibles.</w:t>
       </w:r>
     </w:p>
     <w:p>
       <w:r>
-        <w:t>Preuve : Destination inchangée, libellé explicite et identification visuelle vérifiées.</w:t>
+        <w:rPr>
+          <w:b/>
+        </w:rPr>
+        <w:t>Preuve :</w:t>
+      </w:r>
+      <w:r>
+        <w:t xml:space="preserve"> Destination inchangée, libellé explicite et identification visuelle vérifiées.</w:t>
       </w:r>
     </w:p>
     <w:p>
@@ -1170,37 +1590,79 @@
     </w:p>
     <w:p>
       <w:r>
-        <w:t>Problème : Le statut du document apparaît seulement dans l'en-tête.</w:t>
+        <w:rPr>
+          <w:b/>
+        </w:rPr>
+        <w:t>Problème :</w:t>
+      </w:r>
+      <w:r>
+        <w:t xml:space="preserve"> Le statut du document apparaît seulement dans l'en-tête.</w:t>
       </w:r>
     </w:p>
     <w:p>
       <w:r>
-        <w:t>Pourquoi : Une information essentielle reste disponible même si l'en-tête n'est pas restitué.</w:t>
+        <w:rPr>
+          <w:b/>
+        </w:rPr>
+        <w:t>Pourquoi :</w:t>
+      </w:r>
+      <w:r>
+        <w:t xml:space="preserve"> Une information essentielle reste disponible même si l'en-tête n'est pas restitué.</w:t>
       </w:r>
     </w:p>
     <w:p>
       <w:r>
-        <w:t>Règle : Ne jamais faire porter une information essentielle uniquement par un filigrane, un en-tête ou un arrière-plan.</w:t>
+        <w:rPr>
+          <w:b/>
+        </w:rPr>
+        <w:t>Règle :</w:t>
+      </w:r>
+      <w:r>
+        <w:t xml:space="preserve"> Ne jamais faire porter une information essentielle uniquement par un filigrane, un en-tête ou un arrière-plan.</w:t>
       </w:r>
     </w:p>
     <w:p>
       <w:r>
-        <w:t>Dans Word : Ajouter le statut dans le corps avec un style adapté ; l'en-tête peut le conserver, sans en être l'unique porteur.</w:t>
+        <w:rPr>
+          <w:b/>
+        </w:rPr>
+        <w:t>Dans Word :</w:t>
+      </w:r>
+      <w:r>
+        <w:t xml:space="preserve"> Ajouter le statut dans le corps avec un style adapté ; l'en-tête peut le conserver, sans en être l'unique porteur.</w:t>
       </w:r>
     </w:p>
     <w:p>
       <w:r>
-        <w:t>Dans LibreOffice Writer : Ajouter le statut dans le corps avec un style adapté ; l'en-tête peut le conserver, sans en être l'unique porteur.</w:t>
+        <w:rPr>
+          <w:b/>
+        </w:rPr>
+        <w:t>Dans LibreOffice Writer :</w:t>
+      </w:r>
+      <w:r>
+        <w:t xml:space="preserve"> Ajouter le statut dans le corps avec un style adapté ; l'en-tête peut le conserver, sans en être l'unique porteur.</w:t>
       </w:r>
     </w:p>
     <w:p>
       <w:r>
-        <w:t>À faire : Reprendre le même statut à un emplacement logique du corps.</w:t>
+        <w:rPr>
+          <w:b/>
+        </w:rPr>
+        <w:t>À faire :</w:t>
+      </w:r>
+      <w:r>
+        <w:t xml:space="preserve"> Reprendre le même statut à un emplacement logique du corps.</w:t>
       </w:r>
     </w:p>
     <w:p>
       <w:r>
-        <w:t>Preuve : Statut compréhensible dans le texte linéarisé sans en-tête ni arrière-plan.</w:t>
+        <w:rPr>
+          <w:b/>
+        </w:rPr>
+        <w:t>Preuve :</w:t>
+      </w:r>
+      <w:r>
+        <w:t xml:space="preserve"> Statut compréhensible dans le texte linéarisé sans en-tête ni arrière-plan.</w:t>
       </w:r>
     </w:p>
     <w:p>
@@ -1241,37 +1703,79 @@
     </w:p>
     <w:p>
       <w:r>
-        <w:t>Problème : Une couleur volontairement insuffisante est utilisée sans mesure.</w:t>
+        <w:rPr>
+          <w:b/>
+        </w:rPr>
+        <w:t>Problème :</w:t>
+      </w:r>
+      <w:r>
+        <w:t xml:space="preserve"> Une couleur volontairement insuffisante est utilisée sans mesure.</w:t>
       </w:r>
     </w:p>
     <w:p>
       <w:r>
-        <w:t>Pourquoi : Les textes et éléments graphiques restent perceptibles avec une vision réduite ou altérée.</w:t>
+        <w:rPr>
+          <w:b/>
+        </w:rPr>
+        <w:t>Pourquoi :</w:t>
+      </w:r>
+      <w:r>
+        <w:t xml:space="preserve"> Les textes et éléments graphiques restent perceptibles avec une vision réduite ou altérée.</w:t>
       </w:r>
     </w:p>
     <w:p>
       <w:r>
-        <w:t>Règle : Mesurer au moins 4,5 pour 1 pour le texte normal et 3 pour 1 pour le grand texte ou les éléments graphiques pertinents.</w:t>
+        <w:rPr>
+          <w:b/>
+        </w:rPr>
+        <w:t>Règle :</w:t>
+      </w:r>
+      <w:r>
+        <w:t xml:space="preserve"> Mesurer au moins 4,5 pour 1 pour le texte normal et 3 pour 1 pour le grand texte ou les éléments graphiques pertinents.</w:t>
       </w:r>
     </w:p>
     <w:p>
       <w:r>
-        <w:t>Dans Word : Relever les couleurs de police et de fond, mesurer avec l'outil de contraste, puis modifier la couleur de police.</w:t>
+        <w:rPr>
+          <w:b/>
+        </w:rPr>
+        <w:t>Dans Word :</w:t>
+      </w:r>
+      <w:r>
+        <w:t xml:space="preserve"> Relever les couleurs de police et de fond, mesurer avec l'outil de contraste, puis modifier la couleur de police.</w:t>
       </w:r>
     </w:p>
     <w:p>
       <w:r>
-        <w:t>Dans LibreOffice Writer : Relever les couleurs de caractère et d'arrière-plan, mesurer, puis modifier la couleur de caractère.</w:t>
+        <w:rPr>
+          <w:b/>
+        </w:rPr>
+        <w:t>Dans LibreOffice Writer :</w:t>
+      </w:r>
+      <w:r>
+        <w:t xml:space="preserve"> Relever les couleurs de caractère et d'arrière-plan, mesurer, puis modifier la couleur de caractère.</w:t>
       </w:r>
     </w:p>
     <w:p>
       <w:r>
-        <w:t>À faire : Mesurer la combinaison puis choisir une couleur qui atteint le seuil applicable.</w:t>
+        <w:rPr>
+          <w:b/>
+        </w:rPr>
+        <w:t>À faire :</w:t>
+      </w:r>
+      <w:r>
+        <w:t xml:space="preserve"> Mesurer la combinaison puis choisir une couleur qui atteint le seuil applicable.</w:t>
       </w:r>
     </w:p>
     <w:p>
       <w:r>
-        <w:t>Preuve : Ratio calculé conservé et couleurs finales vérifiées dans le document.</w:t>
+        <w:rPr>
+          <w:b/>
+        </w:rPr>
+        <w:t>Preuve :</w:t>
+      </w:r>
+      <w:r>
+        <w:t xml:space="preserve"> Ratio calculé conservé et couleurs finales vérifiées dans le document.</w:t>
       </w:r>
     </w:p>
     <w:p>
@@ -1300,37 +1804,79 @@
     </w:p>
     <w:p>
       <w:r>
-        <w:t>Problème : Un graphique distingue ses séries uniquement par la couleur.</w:t>
+        <w:rPr>
+          <w:b/>
+        </w:rPr>
+        <w:t>Problème :</w:t>
+      </w:r>
+      <w:r>
+        <w:t xml:space="preserve"> Un graphique distingue ses séries uniquement par la couleur.</w:t>
       </w:r>
     </w:p>
     <w:p>
       <w:r>
-        <w:t>Pourquoi : L'information reste disponible sans perception fiable des couleurs.</w:t>
+        <w:rPr>
+          <w:b/>
+        </w:rPr>
+        <w:t>Pourquoi :</w:t>
+      </w:r>
+      <w:r>
+        <w:t xml:space="preserve"> L'information reste disponible sans perception fiable des couleurs.</w:t>
       </w:r>
     </w:p>
     <w:p>
       <w:r>
-        <w:t>Règle : Ajouter étiquettes, motifs ou un équivalent textuel complet à tout code couleur porteur d'information.</w:t>
+        <w:rPr>
+          <w:b/>
+        </w:rPr>
+        <w:t>Règle :</w:t>
+      </w:r>
+      <w:r>
+        <w:t xml:space="preserve"> Ajouter étiquettes, motifs ou un équivalent textuel complet à tout code couleur porteur d'information.</w:t>
       </w:r>
     </w:p>
     <w:p>
       <w:r>
-        <w:t>Dans Word : Insertion &gt; Graphique &gt; Histogramme groupé, reporter les valeurs affichées dans l'image, puis afficher les étiquettes et appliquer des motifs distincts.</w:t>
+        <w:rPr>
+          <w:b/>
+        </w:rPr>
+        <w:t>Dans Word :</w:t>
+      </w:r>
+      <w:r>
+        <w:t xml:space="preserve"> Insertion &gt; Graphique &gt; Histogramme groupé, reporter les valeurs affichées dans l'image, puis afficher les étiquettes et appliquer des motifs distincts.</w:t>
       </w:r>
     </w:p>
     <w:p>
       <w:r>
-        <w:t>Dans LibreOffice Writer : Insertion &gt; Diagramme, reporter les valeurs affichées dans l'image, puis afficher les étiquettes et choisir des remplissages distincts.</w:t>
+        <w:rPr>
+          <w:b/>
+        </w:rPr>
+        <w:t>Dans LibreOffice Writer :</w:t>
+      </w:r>
+      <w:r>
+        <w:t xml:space="preserve"> Insertion &gt; Diagramme, reporter les valeurs affichées dans l'image, puis afficher les étiquettes et choisir des remplissages distincts.</w:t>
       </w:r>
     </w:p>
     <w:p>
       <w:r>
-        <w:t>À faire : Reconstruire dans Word le graphique à partir des valeurs affichées dans l'image, puis ajouter des étiquettes et des motifs ou conserver un équivalent textuel complet.</w:t>
+        <w:rPr>
+          <w:b/>
+        </w:rPr>
+        <w:t>À faire :</w:t>
+      </w:r>
+      <w:r>
+        <w:t xml:space="preserve"> Reconstruire dans Word le graphique à partir des valeurs affichées dans l'image, puis ajouter des étiquettes et des motifs ou conserver un équivalent textuel complet.</w:t>
       </w:r>
     </w:p>
     <w:p>
       <w:r>
-        <w:t>Preuve : Séries et conclusions identifiables en niveaux de gris et dans l'équivalent textuel.</w:t>
+        <w:rPr>
+          <w:b/>
+        </w:rPr>
+        <w:t>Preuve :</w:t>
+      </w:r>
+      <w:r>
+        <w:t xml:space="preserve"> Séries et conclusions identifiables en niveaux de gris et dans l'équivalent textuel.</w:t>
       </w:r>
     </w:p>
     <w:p>
@@ -1396,37 +1942,79 @@
     </w:p>
     <w:p>
       <w:r>
-        <w:t>Problème : Un tableau de données cumule en-tête non identifié, fusion et ligne fractionnable.</w:t>
+        <w:rPr>
+          <w:b/>
+        </w:rPr>
+        <w:t>Problème :</w:t>
+      </w:r>
+      <w:r>
+        <w:t xml:space="preserve"> Un tableau de données cumule en-tête non identifié, fusion et ligne fractionnable.</w:t>
       </w:r>
     </w:p>
     <w:p>
       <w:r>
-        <w:t>Pourquoi : Les relations entre en-têtes et cellules restent compréhensibles et navigables.</w:t>
+        <w:rPr>
+          <w:b/>
+        </w:rPr>
+        <w:t>Pourquoi :</w:t>
+      </w:r>
+      <w:r>
+        <w:t xml:space="preserve"> Les relations entre en-têtes et cellules restent compréhensibles et navigables.</w:t>
       </w:r>
     </w:p>
     <w:p>
       <w:r>
-        <w:t>Règle : Utiliser un tableau de données titré, sans fusion, imbrication, fractionnement de ligne ni usage de mise en page, avec en-tête identifié et répété.</w:t>
+        <w:rPr>
+          <w:b/>
+        </w:rPr>
+        <w:t>Règle :</w:t>
+      </w:r>
+      <w:r>
+        <w:t xml:space="preserve"> Utiliser un tableau de données titré, sans fusion, imbrication, fractionnement de ligne ni usage de mise en page, avec en-tête identifié et répété.</w:t>
       </w:r>
     </w:p>
     <w:p>
       <w:r>
-        <w:t>Dans Word : Outils de tableau &gt; Disposition pour défusionner ; Propriétés du tableau pour répéter l'en-tête et interdire le fractionnement des lignes.</w:t>
+        <w:rPr>
+          <w:b/>
+        </w:rPr>
+        <w:t>Dans Word :</w:t>
+      </w:r>
+      <w:r>
+        <w:t xml:space="preserve"> Outils de tableau &gt; Disposition pour défusionner ; Propriétés du tableau pour répéter l'en-tête et interdire le fractionnement des lignes.</w:t>
       </w:r>
     </w:p>
     <w:p>
       <w:r>
-        <w:t>Dans LibreOffice Writer : Tableau &gt; Propriétés pour simplifier la grille, répéter les premières lignes et éviter le fractionnement.</w:t>
+        <w:rPr>
+          <w:b/>
+        </w:rPr>
+        <w:t>Dans LibreOffice Writer :</w:t>
+      </w:r>
+      <w:r>
+        <w:t xml:space="preserve"> Tableau &gt; Propriétés pour simplifier la grille, répéter les premières lignes et éviter le fractionnement.</w:t>
       </w:r>
     </w:p>
     <w:p>
       <w:r>
-        <w:t>À faire : Simplifier la structure, identifier l'en-tête et régler sa répétition ainsi que les lignes.</w:t>
+        <w:rPr>
+          <w:b/>
+        </w:rPr>
+        <w:t>À faire :</w:t>
+      </w:r>
+      <w:r>
+        <w:t xml:space="preserve"> Simplifier la structure, identifier l'en-tête et régler sa répétition ainsi que les lignes.</w:t>
       </w:r>
     </w:p>
     <w:p>
       <w:r>
-        <w:t>Preuve : XML sans fusion ni imbrication et relations de cellules vérifiées à la lecture.</w:t>
+        <w:rPr>
+          <w:b/>
+        </w:rPr>
+        <w:t>Preuve :</w:t>
+      </w:r>
+      <w:r>
+        <w:t xml:space="preserve"> XML sans fusion ni imbrication et relations de cellules vérifiées à la lecture.</w:t>
       </w:r>
     </w:p>
     <w:p>
@@ -1629,37 +2217,79 @@
     </w:p>
     <w:p>
       <w:r>
-        <w:t>Problème : Le document et une expression étrangère possèdent une langue absente ou incohérente.</w:t>
+        <w:rPr>
+          <w:b/>
+        </w:rPr>
+        <w:t>Problème :</w:t>
+      </w:r>
+      <w:r>
+        <w:t xml:space="preserve"> Le document et une expression étrangère possèdent une langue absente ou incohérente.</w:t>
       </w:r>
     </w:p>
     <w:p>
       <w:r>
-        <w:t>Pourquoi : La synthèse vocale emploie la prononciation appropriée.</w:t>
+        <w:rPr>
+          <w:b/>
+        </w:rPr>
+        <w:t>Pourquoi :</w:t>
+      </w:r>
+      <w:r>
+        <w:t xml:space="preserve"> La synthèse vocale emploie la prononciation appropriée.</w:t>
       </w:r>
     </w:p>
     <w:p>
       <w:r>
-        <w:t>Règle : Définir la langue principale puis baliser chaque passage dans une autre langue.</w:t>
+        <w:rPr>
+          <w:b/>
+        </w:rPr>
+        <w:t>Règle :</w:t>
+      </w:r>
+      <w:r>
+        <w:t xml:space="preserve"> Définir la langue principale puis baliser chaque passage dans une autre langue.</w:t>
       </w:r>
     </w:p>
     <w:p>
       <w:r>
-        <w:t>Dans Word : Révision &gt; Langue &gt; Définir la langue de vérification pour le document puis pour le passage sélectionné.</w:t>
+        <w:rPr>
+          <w:b/>
+        </w:rPr>
+        <w:t>Dans Word :</w:t>
+      </w:r>
+      <w:r>
+        <w:t xml:space="preserve"> Révision &gt; Langue &gt; Définir la langue de vérification pour le document puis pour le passage sélectionné.</w:t>
       </w:r>
     </w:p>
     <w:p>
       <w:r>
-        <w:t>Dans LibreOffice Writer : Outils &gt; Langue pour tout le texte, puis langue du caractère pour le passage sélectionné.</w:t>
+        <w:rPr>
+          <w:b/>
+        </w:rPr>
+        <w:t>Dans LibreOffice Writer :</w:t>
+      </w:r>
+      <w:r>
+        <w:t xml:space="preserve"> Outils &gt; Langue pour tout le texte, puis langue du caractère pour le passage sélectionné.</w:t>
       </w:r>
     </w:p>
     <w:p>
       <w:r>
-        <w:t>À faire : Régler la langue principale puis celle du passage étranger.</w:t>
+        <w:rPr>
+          <w:b/>
+        </w:rPr>
+        <w:t>À faire :</w:t>
+      </w:r>
+      <w:r>
+        <w:t xml:space="preserve"> Régler la langue principale puis celle du passage étranger.</w:t>
       </w:r>
     </w:p>
     <w:p>
       <w:r>
-        <w:t>Preuve : Propriétés et XML de langue cohérents</w:t>
+        <w:rPr>
+          <w:b/>
+        </w:rPr>
+        <w:t>Preuve :</w:t>
+      </w:r>
+      <w:r>
+        <w:t xml:space="preserve"> Propriétés et XML de langue cohérents</w:t>
       </w:r>
     </w:p>
     <w:p>
@@ -1688,37 +2318,79 @@
     </w:p>
     <w:p>
       <w:r>
-        <w:t>Problème : Le corps utilise une police, une taille, un interligne ou un alignement qui réduit la lisibilité.</w:t>
+        <w:rPr>
+          <w:b/>
+        </w:rPr>
+        <w:t>Problème :</w:t>
+      </w:r>
+      <w:r>
+        <w:t xml:space="preserve"> Le corps utilise une police, une taille, un interligne ou un alignement qui réduit la lisibilité.</w:t>
       </w:r>
     </w:p>
     <w:p>
       <w:r>
-        <w:t>Pourquoi : Le texte demande moins d'effort de lecture et reste homogène.</w:t>
+        <w:rPr>
+          <w:b/>
+        </w:rPr>
+        <w:t>Pourquoi :</w:t>
+      </w:r>
+      <w:r>
+        <w:t xml:space="preserve"> Le texte demande moins d'effort de lecture et reste homogène.</w:t>
       </w:r>
     </w:p>
     <w:p>
       <w:r>
-        <w:t>Règle : Employer une police sans sérif, au moins 12 points, un interligne d'au moins 1,15 et un alignement à gauche.</w:t>
+        <w:rPr>
+          <w:b/>
+        </w:rPr>
+        <w:t>Règle :</w:t>
+      </w:r>
+      <w:r>
+        <w:t xml:space="preserve"> Employer une police sans sérif, au moins 12 points, un interligne d'au moins 1,15 et un alignement à gauche.</w:t>
       </w:r>
     </w:p>
     <w:p>
       <w:r>
-        <w:t>Dans Word : Accueil &gt; Styles &gt; Modifier le style Normal, puis régler police, taille, alignement et paragraphe.</w:t>
+        <w:rPr>
+          <w:b/>
+        </w:rPr>
+        <w:t>Dans Word :</w:t>
+      </w:r>
+      <w:r>
+        <w:t xml:space="preserve"> Accueil &gt; Styles &gt; Modifier le style Normal, puis régler police, taille, alignement et paragraphe.</w:t>
       </w:r>
     </w:p>
     <w:p>
       <w:r>
-        <w:t>Dans LibreOffice Writer : Styles &gt; Gérer les styles &gt; modifier Style de paragraphe par défaut, puis régler police et retraits et espacement.</w:t>
+        <w:rPr>
+          <w:b/>
+        </w:rPr>
+        <w:t>Dans LibreOffice Writer :</w:t>
+      </w:r>
+      <w:r>
+        <w:t xml:space="preserve"> Styles &gt; Gérer les styles &gt; modifier Style de paragraphe par défaut, puis régler police et retraits et espacement.</w:t>
       </w:r>
     </w:p>
     <w:p>
       <w:r>
-        <w:t>À faire : Modifier le style du corps plutôt que corriger les paragraphes un par un.</w:t>
+        <w:rPr>
+          <w:b/>
+        </w:rPr>
+        <w:t>À faire :</w:t>
+      </w:r>
+      <w:r>
+        <w:t xml:space="preserve"> Modifier le style du corps plutôt que corriger les paragraphes un par un.</w:t>
       </w:r>
     </w:p>
     <w:p>
       <w:r>
-        <w:t>Preuve : Propriétés typographiques contrôlées dans le DOCX et lisibilité relue.</w:t>
+        <w:rPr>
+          <w:b/>
+        </w:rPr>
+        <w:t>Preuve :</w:t>
+      </w:r>
+      <w:r>
+        <w:t xml:space="preserve"> Propriétés typographiques contrôlées dans le DOCX et lisibilité relue.</w:t>
       </w:r>
     </w:p>
     <w:p>
@@ -1742,37 +2414,79 @@
     </w:p>
     <w:p>
       <w:r>
-        <w:t>Problème : Un texte est saisi directement en capitales sans accents.</w:t>
+        <w:rPr>
+          <w:b/>
+        </w:rPr>
+        <w:t>Problème :</w:t>
+      </w:r>
+      <w:r>
+        <w:t xml:space="preserve"> Un texte est saisi directement en capitales sans accents.</w:t>
       </w:r>
     </w:p>
     <w:p>
       <w:r>
-        <w:t>Pourquoi : Les accents, la recherche et la restitution du texte restent corrects.</w:t>
+        <w:rPr>
+          <w:b/>
+        </w:rPr>
+        <w:t>Pourquoi :</w:t>
+      </w:r>
+      <w:r>
+        <w:t xml:space="preserve"> Les accents, la recherche et la restitution du texte restent corrects.</w:t>
       </w:r>
     </w:p>
     <w:p>
       <w:r>
-        <w:t>Règle : Saisir les mots normalement avec leurs accents puis appliquer l'apparence en majuscules par le style.</w:t>
+        <w:rPr>
+          <w:b/>
+        </w:rPr>
+        <w:t>Règle :</w:t>
+      </w:r>
+      <w:r>
+        <w:t xml:space="preserve"> Saisir les mots normalement avec leurs accents puis appliquer l'apparence en majuscules par le style.</w:t>
       </w:r>
     </w:p>
     <w:p>
       <w:r>
-        <w:t>Dans Word : Corriger le texte, puis Police &gt; Effets &gt; Majuscules si cette apparence est nécessaire.</w:t>
+        <w:rPr>
+          <w:b/>
+        </w:rPr>
+        <w:t>Dans Word :</w:t>
+      </w:r>
+      <w:r>
+        <w:t xml:space="preserve"> Corriger le texte, puis Police &gt; Effets &gt; Majuscules si cette apparence est nécessaire.</w:t>
       </w:r>
     </w:p>
     <w:p>
       <w:r>
-        <w:t>Dans LibreOffice Writer : Corriger le texte, puis Format &gt; Caractère &gt; Effets de caractères &gt; Majuscules.</w:t>
+        <w:rPr>
+          <w:b/>
+        </w:rPr>
+        <w:t>Dans LibreOffice Writer :</w:t>
+      </w:r>
+      <w:r>
+        <w:t xml:space="preserve"> Corriger le texte, puis Format &gt; Caractère &gt; Effets de caractères &gt; Majuscules.</w:t>
       </w:r>
     </w:p>
     <w:p>
       <w:r>
-        <w:t>À faire : Rétablir la saisie normale et appliquer la casse visuelle par la mise en forme.</w:t>
+        <w:rPr>
+          <w:b/>
+        </w:rPr>
+        <w:t>À faire :</w:t>
+      </w:r>
+      <w:r>
+        <w:t xml:space="preserve"> Rétablir la saisie normale et appliquer la casse visuelle par la mise en forme.</w:t>
       </w:r>
     </w:p>
     <w:p>
       <w:r>
-        <w:t>Preuve : Texte XML accentué et contrôle visuel de la casse.</w:t>
+        <w:rPr>
+          <w:b/>
+        </w:rPr>
+        <w:t>Preuve :</w:t>
+      </w:r>
+      <w:r>
+        <w:t xml:space="preserve"> Texte XML accentué et contrôle visuel de la casse.</w:t>
       </w:r>
     </w:p>
     <w:p>
@@ -1802,37 +2516,79 @@
     </w:p>
     <w:p>
       <w:r>
-        <w:t>Problème : Un acronyme n'est jamais développé et les mots en majuscules échappent à la vérification.</w:t>
+        <w:rPr>
+          <w:b/>
+        </w:rPr>
+        <w:t>Problème :</w:t>
+      </w:r>
+      <w:r>
+        <w:t xml:space="preserve"> Un acronyme n'est jamais développé et les mots en majuscules échappent à la vérification.</w:t>
       </w:r>
     </w:p>
     <w:p>
       <w:r>
-        <w:t>Pourquoi : Les termes abrégés deviennent compréhensibles et les erreurs restent détectables.</w:t>
+        <w:rPr>
+          <w:b/>
+        </w:rPr>
+        <w:t>Pourquoi :</w:t>
+      </w:r>
+      <w:r>
+        <w:t xml:space="preserve"> Les termes abrégés deviennent compréhensibles et les erreurs restent détectables.</w:t>
       </w:r>
     </w:p>
     <w:p>
       <w:r>
-        <w:t>Règle : Développer chaque sigle ou acronyme à sa première occurrence et inclure les mots en majuscules dans la vérification orthographique.</w:t>
+        <w:rPr>
+          <w:b/>
+        </w:rPr>
+        <w:t>Règle :</w:t>
+      </w:r>
+      <w:r>
+        <w:t xml:space="preserve"> Développer chaque sigle ou acronyme à sa première occurrence et inclure les mots en majuscules dans la vérification orthographique.</w:t>
       </w:r>
     </w:p>
     <w:p>
       <w:r>
-        <w:t>Dans Word : Développer le terme dans le corps, puis Fichier &gt; Options &gt; Vérification et décocher Ignorer les mots en MAJUSCULES.</w:t>
+        <w:rPr>
+          <w:b/>
+        </w:rPr>
+        <w:t>Dans Word :</w:t>
+      </w:r>
+      <w:r>
+        <w:t xml:space="preserve"> Développer le terme dans le corps, puis Fichier &gt; Options &gt; Vérification et décocher Ignorer les mots en MAJUSCULES.</w:t>
       </w:r>
     </w:p>
     <w:p>
       <w:r>
-        <w:t>Dans LibreOffice Writer : Développer le terme dans le corps, puis Outils &gt; Options &gt; Paramètres linguistiques &gt; Linguistique et vérifier les options de contrôle.</w:t>
+        <w:rPr>
+          <w:b/>
+        </w:rPr>
+        <w:t>Dans LibreOffice Writer :</w:t>
+      </w:r>
+      <w:r>
+        <w:t xml:space="preserve"> Développer le terme dans le corps, puis Outils &gt; Options &gt; Paramètres linguistiques &gt; Linguistique et vérifier les options de contrôle.</w:t>
       </w:r>
     </w:p>
     <w:p>
       <w:r>
-        <w:t>À faire : Développer la première occurrence et activer l'option de vérification correspondante.</w:t>
+        <w:rPr>
+          <w:b/>
+        </w:rPr>
+        <w:t>À faire :</w:t>
+      </w:r>
+      <w:r>
+        <w:t xml:space="preserve"> Développer la première occurrence et activer l'option de vérification correspondante.</w:t>
       </w:r>
     </w:p>
     <w:p>
       <w:r>
-        <w:t>Preuve : Première occurrence compréhensible et faute témoin en majuscules détectée.</w:t>
+        <w:rPr>
+          <w:b/>
+        </w:rPr>
+        <w:t>Preuve :</w:t>
+      </w:r>
+      <w:r>
+        <w:t xml:space="preserve"> Première occurrence compréhensible et faute témoin en majuscules détectée.</w:t>
       </w:r>
     </w:p>
     <w:p>
@@ -1869,37 +2625,79 @@
     </w:p>
     <w:p>
       <w:r>
-        <w:t>Problème : Les propriétés sont absentes et le nom du fichier ne décrit pas son contenu.</w:t>
+        <w:rPr>
+          <w:b/>
+        </w:rPr>
+        <w:t>Problème :</w:t>
+      </w:r>
+      <w:r>
+        <w:t xml:space="preserve"> Les propriétés sont absentes et le nom du fichier ne décrit pas son contenu.</w:t>
       </w:r>
     </w:p>
     <w:p>
       <w:r>
-        <w:t>Pourquoi : Le document est identifiable dans les outils, les listes de fichiers et les technologies d'assistance.</w:t>
+        <w:rPr>
+          <w:b/>
+        </w:rPr>
+        <w:t>Pourquoi :</w:t>
+      </w:r>
+      <w:r>
+        <w:t xml:space="preserve"> Le document est identifiable dans les outils, les listes de fichiers et les technologies d'assistance.</w:t>
       </w:r>
     </w:p>
     <w:p>
       <w:r>
-        <w:t>Règle : Renseigner titre, auteur et langue puis enregistrer sous un nom descriptif.</w:t>
+        <w:rPr>
+          <w:b/>
+        </w:rPr>
+        <w:t>Règle :</w:t>
+      </w:r>
+      <w:r>
+        <w:t xml:space="preserve"> Renseigner titre, auteur et langue puis enregistrer sous un nom descriptif.</w:t>
       </w:r>
     </w:p>
     <w:p>
       <w:r>
-        <w:t>Dans Word : Fichier &gt; Informations &gt; Propriétés &gt; Propriétés avancées, puis Fichier &gt; Enregistrer sous.</w:t>
+        <w:rPr>
+          <w:b/>
+        </w:rPr>
+        <w:t>Dans Word :</w:t>
+      </w:r>
+      <w:r>
+        <w:t xml:space="preserve"> Fichier &gt; Informations &gt; Propriétés &gt; Propriétés avancées, puis Fichier &gt; Enregistrer sous.</w:t>
       </w:r>
     </w:p>
     <w:p>
       <w:r>
-        <w:t>Dans LibreOffice Writer : Fichier &gt; Propriétés, puis Fichier &gt; Enregistrer sous.</w:t>
+        <w:rPr>
+          <w:b/>
+        </w:rPr>
+        <w:t>Dans LibreOffice Writer :</w:t>
+      </w:r>
+      <w:r>
+        <w:t xml:space="preserve"> Fichier &gt; Propriétés, puis Fichier &gt; Enregistrer sous.</w:t>
       </w:r>
     </w:p>
     <w:p>
       <w:r>
-        <w:t>À faire : Compléter les propriétés puis enregistrer une copie sous un nom descriptif.</w:t>
+        <w:rPr>
+          <w:b/>
+        </w:rPr>
+        <w:t>À faire :</w:t>
+      </w:r>
+      <w:r>
+        <w:t xml:space="preserve"> Compléter les propriétés puis enregistrer une copie sous un nom descriptif.</w:t>
       </w:r>
     </w:p>
     <w:p>
       <w:r>
-        <w:t>Preuve : Métadonnées inspectées dans le DOCX et nom de sortie relu.</w:t>
+        <w:rPr>
+          <w:b/>
+        </w:rPr>
+        <w:t>Preuve :</w:t>
+      </w:r>
+      <w:r>
+        <w:t xml:space="preserve"> Métadonnées inspectées dans le DOCX et nom de sortie relu.</w:t>
       </w:r>
     </w:p>
     <w:p>
@@ -1923,37 +2721,79 @@
     </w:p>
     <w:p>
       <w:r>
-        <w:t>Problème : Cette étape de finalisation ne peut pas être prouvée par le DOCX seul.</w:t>
+        <w:rPr>
+          <w:b/>
+        </w:rPr>
+        <w:t>Problème :</w:t>
+      </w:r>
+      <w:r>
+        <w:t xml:space="preserve"> Cette étape de finalisation ne peut pas être prouvée par le DOCX seul.</w:t>
       </w:r>
     </w:p>
     <w:p>
       <w:r>
-        <w:t>Pourquoi : Le PDF conserve les propriétés, la structure et les accès issus des titres.</w:t>
+        <w:rPr>
+          <w:b/>
+        </w:rPr>
+        <w:t>Pourquoi :</w:t>
+      </w:r>
+      <w:r>
+        <w:t xml:space="preserve"> Le PDF conserve les propriétés, la structure et les accès issus des titres.</w:t>
       </w:r>
     </w:p>
     <w:p>
       <w:r>
-        <w:t>Règle : Exporter avec propriétés, balises de structure et signets générés depuis les titres.</w:t>
+        <w:rPr>
+          <w:b/>
+        </w:rPr>
+        <w:t>Règle :</w:t>
+      </w:r>
+      <w:r>
+        <w:t xml:space="preserve"> Exporter avec propriétés, balises de structure et signets générés depuis les titres.</w:t>
       </w:r>
     </w:p>
     <w:p>
       <w:r>
-        <w:t>Dans Word : Vérifier les propriétés dans Fichier &gt; Informations, puis Fichier &gt; Enregistrer sous ou Exporter &gt; PDF &gt; Options et activer les balises de structure ainsi que les signets issus des titres.</w:t>
+        <w:rPr>
+          <w:b/>
+        </w:rPr>
+        <w:t>Dans Word :</w:t>
+      </w:r>
+      <w:r>
+        <w:t xml:space="preserve"> Vérifier les propriétés dans Fichier &gt; Informations, puis Fichier &gt; Enregistrer sous ou Exporter &gt; PDF &gt; Options et activer les balises de structure ainsi que les signets issus des titres.</w:t>
       </w:r>
     </w:p>
     <w:p>
       <w:r>
-        <w:t>Dans LibreOffice Writer : Vérifier les propriétés dans Fichier &gt; Propriétés, puis Fichier &gt; Exporter vers &gt; Exporter au format PDF et activer PDF balisé ainsi que l'export des repères.</w:t>
+        <w:rPr>
+          <w:b/>
+        </w:rPr>
+        <w:t>Dans LibreOffice Writer :</w:t>
+      </w:r>
+      <w:r>
+        <w:t xml:space="preserve"> Vérifier les propriétés dans Fichier &gt; Propriétés, puis Fichier &gt; Exporter vers &gt; Exporter au format PDF et activer PDF balisé ainsi que l'export des repères.</w:t>
       </w:r>
     </w:p>
     <w:p>
       <w:r>
-        <w:t>À faire : Exporter le DOCX corrigé en activant les options d'accessibilité prévues.</w:t>
+        <w:rPr>
+          <w:b/>
+        </w:rPr>
+        <w:t>À faire :</w:t>
+      </w:r>
+      <w:r>
+        <w:t xml:space="preserve"> Exporter le DOCX corrigé en activant les options d'accessibilité prévues.</w:t>
       </w:r>
     </w:p>
     <w:p>
       <w:r>
-        <w:t>Preuve : Propriétés et structure inspectées dans le PDF</w:t>
+        <w:rPr>
+          <w:b/>
+        </w:rPr>
+        <w:t>Preuve :</w:t>
+      </w:r>
+      <w:r>
+        <w:t xml:space="preserve"> Propriétés et structure inspectées dans le PDF</w:t>
       </w:r>
     </w:p>
     <w:p>
@@ -1972,37 +2812,79 @@
     </w:p>
     <w:p>
       <w:r>
-        <w:t>Problème : Cette étape de finalisation ne peut pas être prouvée par le DOCX seul.</w:t>
+        <w:rPr>
+          <w:b/>
+        </w:rPr>
+        <w:t>Problème :</w:t>
+      </w:r>
+      <w:r>
+        <w:t xml:space="preserve"> Cette étape de finalisation ne peut pas être prouvée par le DOCX seul.</w:t>
       </w:r>
     </w:p>
     <w:p>
       <w:r>
-        <w:t>Pourquoi : L'outil repère certains défauts mais ne remplace pas le jugement humain.</w:t>
+        <w:rPr>
+          <w:b/>
+        </w:rPr>
+        <w:t>Pourquoi :</w:t>
+      </w:r>
+      <w:r>
+        <w:t xml:space="preserve"> L'outil repère certains défauts mais ne remplace pas le jugement humain.</w:t>
       </w:r>
     </w:p>
     <w:p>
       <w:r>
-        <w:t>Règle : Traiter les alertes pertinentes et expliquer toute alerte résiduelle ; viser zéro erreur sans en faire une preuve de conformité.</w:t>
+        <w:rPr>
+          <w:b/>
+        </w:rPr>
+        <w:t>Règle :</w:t>
+      </w:r>
+      <w:r>
+        <w:t xml:space="preserve"> Traiter les alertes pertinentes et expliquer toute alerte résiduelle ; viser zéro erreur sans en faire une preuve de conformité.</w:t>
       </w:r>
     </w:p>
     <w:p>
       <w:r>
-        <w:t>Dans Word : Révision &gt; Vérifier l'accessibilité, parcourir chaque résultat et utiliser les actions recommandées avec discernement.</w:t>
+        <w:rPr>
+          <w:b/>
+        </w:rPr>
+        <w:t>Dans Word :</w:t>
+      </w:r>
+      <w:r>
+        <w:t xml:space="preserve"> Révision &gt; Vérifier l'accessibilité, parcourir chaque résultat et utiliser les actions recommandées avec discernement.</w:t>
       </w:r>
     </w:p>
     <w:p>
       <w:r>
-        <w:t>Dans LibreOffice Writer : Outils &gt; Vérification de l'accessibilité, parcourir les résultats et vérifier manuellement les points non couverts.</w:t>
+        <w:rPr>
+          <w:b/>
+        </w:rPr>
+        <w:t>Dans LibreOffice Writer :</w:t>
+      </w:r>
+      <w:r>
+        <w:t xml:space="preserve"> Outils &gt; Vérification de l'accessibilité, parcourir les résultats et vérifier manuellement les points non couverts.</w:t>
       </w:r>
     </w:p>
     <w:p>
       <w:r>
-        <w:t>À faire : Lancer le vérificateur, corriger les erreurs pertinentes et consigner les alertes restantes.</w:t>
+        <w:rPr>
+          <w:b/>
+        </w:rPr>
+        <w:t>À faire :</w:t>
+      </w:r>
+      <w:r>
+        <w:t xml:space="preserve"> Lancer le vérificateur, corriger les erreurs pertinentes et consigner les alertes restantes.</w:t>
       </w:r>
     </w:p>
     <w:p>
       <w:r>
-        <w:t>Preuve : Relevé du vérificateur conservé et alertes résiduelles justifiées.</w:t>
+        <w:rPr>
+          <w:b/>
+        </w:rPr>
+        <w:t>Preuve :</w:t>
+      </w:r>
+      <w:r>
+        <w:t xml:space="preserve"> Relevé du vérificateur conservé et alertes résiduelles justifiées.</w:t>
       </w:r>
     </w:p>
     <w:p>
@@ -2021,37 +2903,79 @@
     </w:p>
     <w:p>
       <w:r>
-        <w:t>Problème : Cette étape de finalisation ne peut pas être prouvée par le DOCX seul.</w:t>
+        <w:rPr>
+          <w:b/>
+        </w:rPr>
+        <w:t>Problème :</w:t>
+      </w:r>
+      <w:r>
+        <w:t xml:space="preserve"> Cette étape de finalisation ne peut pas être prouvée par le DOCX seul.</w:t>
       </w:r>
     </w:p>
     <w:p>
       <w:r>
-        <w:t>Pourquoi : Les pertes introduites à l'export sont détectées avant diffusion.</w:t>
+        <w:rPr>
+          <w:b/>
+        </w:rPr>
+        <w:t>Pourquoi :</w:t>
+      </w:r>
+      <w:r>
+        <w:t xml:space="preserve"> Les pertes introduites à l'export sont détectées avant diffusion.</w:t>
       </w:r>
     </w:p>
     <w:p>
       <w:r>
-        <w:t>Règle : Contrôler avec PAC, ou Acrobat Pro en alternative, le titre, la langue, les balises et l'ordre de lecture, puis terminer par la checklist humaine.</w:t>
+        <w:rPr>
+          <w:b/>
+        </w:rPr>
+        <w:t>Règle :</w:t>
+      </w:r>
+      <w:r>
+        <w:t xml:space="preserve"> Contrôler avec PAC, ou Acrobat Pro en alternative, le titre, la langue, les balises et l'ordre de lecture, puis terminer par la checklist humaine.</w:t>
       </w:r>
     </w:p>
     <w:p>
       <w:r>
-        <w:t>Dans Word : Ouvrir le PDF exporté dans PAC ; utiliser Acrobat Pro comme alternative si PAC n'est pas disponible.</w:t>
+        <w:rPr>
+          <w:b/>
+        </w:rPr>
+        <w:t>Dans Word :</w:t>
+      </w:r>
+      <w:r>
+        <w:t xml:space="preserve"> Ouvrir le PDF exporté dans PAC ; utiliser Acrobat Pro comme alternative si PAC n'est pas disponible.</w:t>
       </w:r>
     </w:p>
     <w:p>
       <w:r>
-        <w:t>Dans LibreOffice Writer : Ouvrir le PDF exporté dans PAC ; utiliser Acrobat Pro comme alternative si PAC n'est pas disponible.</w:t>
+        <w:rPr>
+          <w:b/>
+        </w:rPr>
+        <w:t>Dans LibreOffice Writer :</w:t>
+      </w:r>
+      <w:r>
+        <w:t xml:space="preserve"> Ouvrir le PDF exporté dans PAC ; utiliser Acrobat Pro comme alternative si PAC n'est pas disponible.</w:t>
       </w:r>
     </w:p>
     <w:p>
       <w:r>
-        <w:t>À faire : Exécuter le contrôle du PDF, traiter les alertes pertinentes et consigner le résultat humain.</w:t>
+        <w:rPr>
+          <w:b/>
+        </w:rPr>
+        <w:t>À faire :</w:t>
+      </w:r>
+      <w:r>
+        <w:t xml:space="preserve"> Exécuter le contrôle du PDF, traiter les alertes pertinentes et consigner le résultat humain.</w:t>
       </w:r>
     </w:p>
     <w:p>
       <w:r>
-        <w:t>Preuve : Rapport PAC ou Acrobat conservé</w:t>
+        <w:rPr>
+          <w:b/>
+        </w:rPr>
+        <w:t>Preuve :</w:t>
+      </w:r>
+      <w:r>
+        <w:t xml:space="preserve"> Rapport PAC ou Acrobat conservé</w:t>
       </w:r>
     </w:p>
     <w:sectPr>

</xml_diff>